<commit_message>
Elaborate non-infectious pathology notes with peer-reviewed research
</commit_message>
<xml_diff>
--- a/ABS_Elephant_NonInfectious_Notes.docx
+++ b/ABS_Elephant_NonInfectious_Notes.docx
@@ -1696,6 +1696,565 @@
         <w:spacing w:after="40"/>
       </w:pPr>
     </w:p>
+    <w:tbl>
+      <w:tblPr>
+        <w:tblStyle w:val="TableGrid"/>
+        <w:tblW w:type="auto" w:w="0"/>
+        <w:tblLook w:firstColumn="1" w:firstRow="1" w:lastColumn="0" w:lastRow="0" w:noHBand="0" w:noVBand="1" w:val="04A0"/>
+      </w:tblPr>
+      <w:tblGrid>
+        <w:gridCol w:w="9638"/>
+      </w:tblGrid>
+      <w:tr>
+        <w:tc>
+          <w:tcPr>
+            <w:tcW w:type="dxa" w:w="9638"/>
+            <w:shd w:val="clear" w:color="auto" w:fill="2D6A4F"/>
+          </w:tcPr>
+          <w:p>
+            <w:pPr>
+              <w:spacing w:before="80" w:after="80"/>
+            </w:pPr>
+            <w:r>
+              <w:rPr>
+                <w:rFonts w:ascii="Calibri" w:hAnsi="Calibri"/>
+                <w:b/>
+                <w:color w:val="FFFFFF"/>
+                <w:sz w:val="21"/>
+              </w:rPr>
+              <w:t>2.3  National Mortality Data — Unnatural Causes (Lok Sabha, 2024)</w:t>
+            </w:r>
+          </w:p>
+        </w:tc>
+      </w:tr>
+    </w:tbl>
+    <w:p>
+      <w:pPr>
+        <w:spacing w:after="40"/>
+      </w:pPr>
+    </w:p>
+    <w:p>
+      <w:pPr>
+        <w:spacing w:after="80"/>
+        <w:jc w:val="both"/>
+      </w:pPr>
+      <w:r>
+        <w:rPr>
+          <w:rFonts w:ascii="Calibri" w:hAnsi="Calibri"/>
+          <w:b w:val="0"/>
+          <w:i w:val="0"/>
+          <w:color w:val="1A1A1A"/>
+          <w:sz w:val="19"/>
+        </w:rPr>
+        <w:t>Government data tabled in the Lok Sabha in July 2024 quantified elephant deaths from unnatural causes over a five-year period. These figures place poisoning in its proper context relative to the dominant unnatural killers — electrocution and train accidents:</w:t>
+      </w:r>
+    </w:p>
+    <w:tbl>
+      <w:tblPr>
+        <w:tblStyle w:val="TableGrid"/>
+        <w:tblW w:type="auto" w:w="0"/>
+        <w:tblLook w:firstColumn="1" w:firstRow="1" w:lastColumn="0" w:lastRow="0" w:noHBand="0" w:noVBand="1" w:val="04A0"/>
+      </w:tblPr>
+      <w:tblGrid>
+        <w:gridCol w:w="2409"/>
+        <w:gridCol w:w="2409"/>
+        <w:gridCol w:w="2409"/>
+        <w:gridCol w:w="2409"/>
+      </w:tblGrid>
+      <w:tr>
+        <w:tc>
+          <w:tcPr>
+            <w:tcW w:type="dxa" w:w="1984"/>
+            <w:shd w:val="clear" w:color="auto" w:fill="2D6A4F"/>
+          </w:tcPr>
+          <w:p>
+            <w:pPr>
+              <w:jc w:val="center"/>
+            </w:pPr>
+            <w:r>
+              <w:rPr>
+                <w:rFonts w:ascii="Calibri" w:hAnsi="Calibri"/>
+                <w:b/>
+                <w:color w:val="FFFFFF"/>
+                <w:sz w:val="17"/>
+              </w:rPr>
+              <w:t>Unnatural Cause</w:t>
+            </w:r>
+          </w:p>
+        </w:tc>
+        <w:tc>
+          <w:tcPr>
+            <w:tcW w:type="dxa" w:w="1134"/>
+            <w:shd w:val="clear" w:color="auto" w:fill="2D6A4F"/>
+          </w:tcPr>
+          <w:p>
+            <w:pPr>
+              <w:jc w:val="center"/>
+            </w:pPr>
+            <w:r>
+              <w:rPr>
+                <w:rFonts w:ascii="Calibri" w:hAnsi="Calibri"/>
+                <w:b/>
+                <w:color w:val="FFFFFF"/>
+                <w:sz w:val="17"/>
+              </w:rPr>
+              <w:t>Deaths (5 yrs)</w:t>
+            </w:r>
+          </w:p>
+        </w:tc>
+        <w:tc>
+          <w:tcPr>
+            <w:tcW w:type="dxa" w:w="850"/>
+            <w:shd w:val="clear" w:color="auto" w:fill="2D6A4F"/>
+          </w:tcPr>
+          <w:p>
+            <w:pPr>
+              <w:jc w:val="center"/>
+            </w:pPr>
+            <w:r>
+              <w:rPr>
+                <w:rFonts w:ascii="Calibri" w:hAnsi="Calibri"/>
+                <w:b/>
+                <w:color w:val="FFFFFF"/>
+                <w:sz w:val="17"/>
+              </w:rPr>
+              <w:t>Share</w:t>
+            </w:r>
+          </w:p>
+        </w:tc>
+        <w:tc>
+          <w:tcPr>
+            <w:tcW w:type="dxa" w:w="5386"/>
+            <w:shd w:val="clear" w:color="auto" w:fill="2D6A4F"/>
+          </w:tcPr>
+          <w:p>
+            <w:pPr>
+              <w:jc w:val="center"/>
+            </w:pPr>
+            <w:r>
+              <w:rPr>
+                <w:rFonts w:ascii="Calibri" w:hAnsi="Calibri"/>
+                <w:b/>
+                <w:color w:val="FFFFFF"/>
+                <w:sz w:val="17"/>
+              </w:rPr>
+              <w:t>Worst-Affected States</w:t>
+            </w:r>
+          </w:p>
+        </w:tc>
+      </w:tr>
+      <w:tr>
+        <w:tc>
+          <w:tcPr>
+            <w:tcW w:type="dxa" w:w="1984"/>
+            <w:shd w:val="clear" w:color="auto" w:fill="FFFFFF"/>
+          </w:tcPr>
+          <w:p>
+            <w:r>
+              <w:rPr>
+                <w:rFonts w:ascii="Calibri" w:hAnsi="Calibri"/>
+                <w:b w:val="0"/>
+                <w:color w:val="1A1A1A"/>
+                <w:sz w:val="17"/>
+              </w:rPr>
+              <w:t>Electrocution</w:t>
+            </w:r>
+          </w:p>
+        </w:tc>
+        <w:tc>
+          <w:tcPr>
+            <w:tcW w:type="dxa" w:w="1134"/>
+            <w:shd w:val="clear" w:color="auto" w:fill="FFFFFF"/>
+          </w:tcPr>
+          <w:p>
+            <w:r>
+              <w:rPr>
+                <w:rFonts w:ascii="Calibri" w:hAnsi="Calibri"/>
+                <w:b w:val="0"/>
+                <w:color w:val="1A1A1A"/>
+                <w:sz w:val="17"/>
+              </w:rPr>
+              <w:t>392</w:t>
+            </w:r>
+          </w:p>
+        </w:tc>
+        <w:tc>
+          <w:tcPr>
+            <w:tcW w:type="dxa" w:w="850"/>
+            <w:shd w:val="clear" w:color="auto" w:fill="FFFFFF"/>
+          </w:tcPr>
+          <w:p>
+            <w:r>
+              <w:rPr>
+                <w:rFonts w:ascii="Calibri" w:hAnsi="Calibri"/>
+                <w:b w:val="0"/>
+                <w:color w:val="1A1A1A"/>
+                <w:sz w:val="17"/>
+              </w:rPr>
+              <w:t>74.2%</w:t>
+            </w:r>
+          </w:p>
+        </w:tc>
+        <w:tc>
+          <w:tcPr>
+            <w:tcW w:type="dxa" w:w="5386"/>
+            <w:shd w:val="clear" w:color="auto" w:fill="FFFFFF"/>
+          </w:tcPr>
+          <w:p>
+            <w:r>
+              <w:rPr>
+                <w:rFonts w:ascii="Calibri" w:hAnsi="Calibri"/>
+                <w:b w:val="0"/>
+                <w:color w:val="1A1A1A"/>
+                <w:sz w:val="17"/>
+              </w:rPr>
+              <w:t>Odisha 71, Assam 55, Karnataka 52, Tamil Nadu 49, Chhattisgarh 32, Jharkhand 30, Kerala 29</w:t>
+            </w:r>
+          </w:p>
+        </w:tc>
+      </w:tr>
+      <w:tr>
+        <w:tc>
+          <w:tcPr>
+            <w:tcW w:type="dxa" w:w="1984"/>
+            <w:shd w:val="clear" w:color="auto" w:fill="EAF7EE"/>
+          </w:tcPr>
+          <w:p>
+            <w:r>
+              <w:rPr>
+                <w:rFonts w:ascii="Calibri" w:hAnsi="Calibri"/>
+                <w:b w:val="0"/>
+                <w:color w:val="1A1A1A"/>
+                <w:sz w:val="17"/>
+              </w:rPr>
+              <w:t>Train accidents</w:t>
+            </w:r>
+          </w:p>
+        </w:tc>
+        <w:tc>
+          <w:tcPr>
+            <w:tcW w:type="dxa" w:w="1134"/>
+            <w:shd w:val="clear" w:color="auto" w:fill="EAF7EE"/>
+          </w:tcPr>
+          <w:p>
+            <w:r>
+              <w:rPr>
+                <w:rFonts w:ascii="Calibri" w:hAnsi="Calibri"/>
+                <w:b w:val="0"/>
+                <w:color w:val="1A1A1A"/>
+                <w:sz w:val="17"/>
+              </w:rPr>
+              <w:t>73</w:t>
+            </w:r>
+          </w:p>
+        </w:tc>
+        <w:tc>
+          <w:tcPr>
+            <w:tcW w:type="dxa" w:w="850"/>
+            <w:shd w:val="clear" w:color="auto" w:fill="EAF7EE"/>
+          </w:tcPr>
+          <w:p>
+            <w:r>
+              <w:rPr>
+                <w:rFonts w:ascii="Calibri" w:hAnsi="Calibri"/>
+                <w:b w:val="0"/>
+                <w:color w:val="1A1A1A"/>
+                <w:sz w:val="17"/>
+              </w:rPr>
+              <w:t>13.8%</w:t>
+            </w:r>
+          </w:p>
+        </w:tc>
+        <w:tc>
+          <w:tcPr>
+            <w:tcW w:type="dxa" w:w="5386"/>
+            <w:shd w:val="clear" w:color="auto" w:fill="EAF7EE"/>
+          </w:tcPr>
+          <w:p>
+            <w:r>
+              <w:rPr>
+                <w:rFonts w:ascii="Calibri" w:hAnsi="Calibri"/>
+                <w:b w:val="0"/>
+                <w:color w:val="1A1A1A"/>
+                <w:sz w:val="17"/>
+              </w:rPr>
+              <w:t>Assam 22, Odisha 16</w:t>
+            </w:r>
+          </w:p>
+        </w:tc>
+      </w:tr>
+      <w:tr>
+        <w:tc>
+          <w:tcPr>
+            <w:tcW w:type="dxa" w:w="1984"/>
+            <w:shd w:val="clear" w:color="auto" w:fill="FFFFFF"/>
+          </w:tcPr>
+          <w:p>
+            <w:r>
+              <w:rPr>
+                <w:rFonts w:ascii="Calibri" w:hAnsi="Calibri"/>
+                <w:b w:val="0"/>
+                <w:color w:val="1A1A1A"/>
+                <w:sz w:val="17"/>
+              </w:rPr>
+              <w:t>Poaching</w:t>
+            </w:r>
+          </w:p>
+        </w:tc>
+        <w:tc>
+          <w:tcPr>
+            <w:tcW w:type="dxa" w:w="1134"/>
+            <w:shd w:val="clear" w:color="auto" w:fill="FFFFFF"/>
+          </w:tcPr>
+          <w:p>
+            <w:r>
+              <w:rPr>
+                <w:rFonts w:ascii="Calibri" w:hAnsi="Calibri"/>
+                <w:b w:val="0"/>
+                <w:color w:val="1A1A1A"/>
+                <w:sz w:val="17"/>
+              </w:rPr>
+              <w:t>50</w:t>
+            </w:r>
+          </w:p>
+        </w:tc>
+        <w:tc>
+          <w:tcPr>
+            <w:tcW w:type="dxa" w:w="850"/>
+            <w:shd w:val="clear" w:color="auto" w:fill="FFFFFF"/>
+          </w:tcPr>
+          <w:p>
+            <w:r>
+              <w:rPr>
+                <w:rFonts w:ascii="Calibri" w:hAnsi="Calibri"/>
+                <w:b w:val="0"/>
+                <w:color w:val="1A1A1A"/>
+                <w:sz w:val="17"/>
+              </w:rPr>
+              <w:t>9.5%</w:t>
+            </w:r>
+          </w:p>
+        </w:tc>
+        <w:tc>
+          <w:tcPr>
+            <w:tcW w:type="dxa" w:w="5386"/>
+            <w:shd w:val="clear" w:color="auto" w:fill="FFFFFF"/>
+          </w:tcPr>
+          <w:p>
+            <w:r>
+              <w:rPr>
+                <w:rFonts w:ascii="Calibri" w:hAnsi="Calibri"/>
+                <w:b w:val="0"/>
+                <w:color w:val="1A1A1A"/>
+                <w:sz w:val="17"/>
+              </w:rPr>
+              <w:t>Odisha 17, Meghalaya 14, Tamil Nadu 10</w:t>
+            </w:r>
+          </w:p>
+        </w:tc>
+      </w:tr>
+      <w:tr>
+        <w:tc>
+          <w:tcPr>
+            <w:tcW w:type="dxa" w:w="1984"/>
+            <w:shd w:val="clear" w:color="auto" w:fill="EAF7EE"/>
+          </w:tcPr>
+          <w:p>
+            <w:r>
+              <w:rPr>
+                <w:rFonts w:ascii="Calibri" w:hAnsi="Calibri"/>
+                <w:b w:val="0"/>
+                <w:color w:val="1A1A1A"/>
+                <w:sz w:val="17"/>
+              </w:rPr>
+              <w:t>Poisoning</w:t>
+            </w:r>
+          </w:p>
+        </w:tc>
+        <w:tc>
+          <w:tcPr>
+            <w:tcW w:type="dxa" w:w="1134"/>
+            <w:shd w:val="clear" w:color="auto" w:fill="EAF7EE"/>
+          </w:tcPr>
+          <w:p>
+            <w:r>
+              <w:rPr>
+                <w:rFonts w:ascii="Calibri" w:hAnsi="Calibri"/>
+                <w:b w:val="0"/>
+                <w:color w:val="1A1A1A"/>
+                <w:sz w:val="17"/>
+              </w:rPr>
+              <w:t>13</w:t>
+            </w:r>
+          </w:p>
+        </w:tc>
+        <w:tc>
+          <w:tcPr>
+            <w:tcW w:type="dxa" w:w="850"/>
+            <w:shd w:val="clear" w:color="auto" w:fill="EAF7EE"/>
+          </w:tcPr>
+          <w:p>
+            <w:r>
+              <w:rPr>
+                <w:rFonts w:ascii="Calibri" w:hAnsi="Calibri"/>
+                <w:b w:val="0"/>
+                <w:color w:val="1A1A1A"/>
+                <w:sz w:val="17"/>
+              </w:rPr>
+              <w:t>2.5%</w:t>
+            </w:r>
+          </w:p>
+        </w:tc>
+        <w:tc>
+          <w:tcPr>
+            <w:tcW w:type="dxa" w:w="5386"/>
+            <w:shd w:val="clear" w:color="auto" w:fill="EAF7EE"/>
+          </w:tcPr>
+          <w:p>
+            <w:r>
+              <w:rPr>
+                <w:rFonts w:ascii="Calibri" w:hAnsi="Calibri"/>
+                <w:b w:val="0"/>
+                <w:color w:val="1A1A1A"/>
+                <w:sz w:val="17"/>
+              </w:rPr>
+              <w:t>Assam 10, Chhattisgarh 2, West Bengal 1</w:t>
+            </w:r>
+          </w:p>
+        </w:tc>
+      </w:tr>
+      <w:tr>
+        <w:tc>
+          <w:tcPr>
+            <w:tcW w:type="dxa" w:w="1984"/>
+            <w:shd w:val="clear" w:color="auto" w:fill="FFFFFF"/>
+          </w:tcPr>
+          <w:p>
+            <w:r>
+              <w:rPr>
+                <w:rFonts w:ascii="Calibri" w:hAnsi="Calibri"/>
+                <w:b w:val="0"/>
+                <w:color w:val="1A1A1A"/>
+                <w:sz w:val="17"/>
+              </w:rPr>
+              <w:t>TOTAL UNNATURAL</w:t>
+            </w:r>
+          </w:p>
+        </w:tc>
+        <w:tc>
+          <w:tcPr>
+            <w:tcW w:type="dxa" w:w="1134"/>
+            <w:shd w:val="clear" w:color="auto" w:fill="FFFFFF"/>
+          </w:tcPr>
+          <w:p>
+            <w:r>
+              <w:rPr>
+                <w:rFonts w:ascii="Calibri" w:hAnsi="Calibri"/>
+                <w:b w:val="0"/>
+                <w:color w:val="1A1A1A"/>
+                <w:sz w:val="17"/>
+              </w:rPr>
+              <w:t>528</w:t>
+            </w:r>
+          </w:p>
+        </w:tc>
+        <w:tc>
+          <w:tcPr>
+            <w:tcW w:type="dxa" w:w="850"/>
+            <w:shd w:val="clear" w:color="auto" w:fill="FFFFFF"/>
+          </w:tcPr>
+          <w:p>
+            <w:r>
+              <w:rPr>
+                <w:rFonts w:ascii="Calibri" w:hAnsi="Calibri"/>
+                <w:b w:val="0"/>
+                <w:color w:val="1A1A1A"/>
+                <w:sz w:val="17"/>
+              </w:rPr>
+              <w:t>100%</w:t>
+            </w:r>
+          </w:p>
+        </w:tc>
+        <w:tc>
+          <w:tcPr>
+            <w:tcW w:type="dxa" w:w="5386"/>
+            <w:shd w:val="clear" w:color="auto" w:fill="FFFFFF"/>
+          </w:tcPr>
+          <w:p>
+            <w:r>
+              <w:rPr>
+                <w:rFonts w:ascii="Calibri" w:hAnsi="Calibri"/>
+                <w:b w:val="0"/>
+                <w:color w:val="1A1A1A"/>
+                <w:sz w:val="17"/>
+              </w:rPr>
+              <w:t>All India</w:t>
+            </w:r>
+          </w:p>
+        </w:tc>
+      </w:tr>
+    </w:tbl>
+    <w:p>
+      <w:pPr>
+        <w:spacing w:after="40"/>
+      </w:pPr>
+    </w:p>
+    <w:p>
+      <w:pPr>
+        <w:spacing w:after="40"/>
+        <w:ind w:left="283" w:hanging="170"/>
+      </w:pPr>
+      <w:r>
+        <w:rPr>
+          <w:rFonts w:ascii="Calibri" w:hAnsi="Calibri"/>
+          <w:color w:val="1A1A1A"/>
+          <w:sz w:val="19"/>
+        </w:rPr>
+        <w:t>•  ELECTROCUTION dominates — 392 of 528 (74%) of all unnatural elephant deaths; see Section 6</w:t>
+      </w:r>
+    </w:p>
+    <w:p>
+      <w:pPr>
+        <w:spacing w:after="40"/>
+        <w:ind w:left="283" w:hanging="170"/>
+      </w:pPr>
+      <w:r>
+        <w:rPr>
+          <w:rFonts w:ascii="Calibri" w:hAnsi="Calibri"/>
+          <w:color w:val="1A1A1A"/>
+          <w:sz w:val="19"/>
+        </w:rPr>
+        <w:t>•  POPULATION CONTEXT: The 2017 all-India synchronised census recorded 29,964 wild elephants — approximately 60% of the global wild Asian elephant population</w:t>
+      </w:r>
+    </w:p>
+    <w:p>
+      <w:pPr>
+        <w:spacing w:after="40"/>
+        <w:ind w:left="283" w:hanging="170"/>
+      </w:pPr>
+      <w:r>
+        <w:rPr>
+          <w:rFonts w:ascii="Calibri" w:hAnsi="Calibri"/>
+          <w:color w:val="1A1A1A"/>
+          <w:sz w:val="19"/>
+        </w:rPr>
+        <w:t>•  Chhattisgarh appears in the worst-affected list for both electrocution (32) and poisoning (2) — directly relevant to this training program</w:t>
+      </w:r>
+    </w:p>
+    <w:p>
+      <w:pPr>
+        <w:spacing w:after="40"/>
+        <w:ind w:left="283" w:hanging="170"/>
+      </w:pPr>
+      <w:r>
+        <w:rPr>
+          <w:rFonts w:ascii="Calibri" w:hAnsi="Calibri"/>
+          <w:color w:val="1A1A1A"/>
+          <w:sz w:val="19"/>
+        </w:rPr>
+        <w:t>•  NOTE: Ministry tallies are periodically revised; figures here reflect the July 2024 Lok Sabha reply (Source: Business Standard / The Week reporting of Lok Sabha Unstarred Question data)</w:t>
+      </w:r>
+    </w:p>
     <w:p>
       <w:pPr>
         <w:spacing w:before="0" w:after="0"/>
@@ -1805,7 +2364,7 @@
           <w:color w:val="1A1A1A"/>
           <w:sz w:val="19"/>
         </w:rPr>
-        <w:t>•  Elephants raiding crops/plantations consume dangerous levels of agrochemicals</w:t>
+        <w:t>•  Elephants raiding crops/plantations consume dangerous levels of agrochemicals; pesticides are also used DELIBERATELY in baits (laced crops, fruit, salt) for retaliatory killing and poaching</w:t>
       </w:r>
     </w:p>
     <w:p>
@@ -1819,21 +2378,7 @@
           <w:color w:val="1A1A1A"/>
           <w:sz w:val="19"/>
         </w:rPr>
-        <w:t>•  Most are deadly NEUROTOXINS: organophosphates (e.g., chlorpyrifos, monocrotophos) and carbamates</w:t>
-      </w:r>
-    </w:p>
-    <w:p>
-      <w:pPr>
-        <w:spacing w:after="40"/>
-        <w:ind w:left="283" w:hanging="170"/>
-      </w:pPr>
-      <w:r>
-        <w:rPr>
-          <w:rFonts w:ascii="Calibri" w:hAnsi="Calibri"/>
-          <w:color w:val="1A1A1A"/>
-          <w:sz w:val="19"/>
-        </w:rPr>
-        <w:t>•  Neonicotinoids (e.g., imidacloprid) — newer systemic insecticides also implicated</w:t>
+        <w:t>•  Most are deadly NEUROTOXINS: organophosphates (OPs) and carbamates; newer neonicotinoids also implicated</w:t>
       </w:r>
     </w:p>
     <w:p>
@@ -1847,7 +2392,365 @@
           <w:color w:val="2D6A4F"/>
           <w:sz w:val="20"/>
         </w:rPr>
-        <w:t>Organophosphate (OP) / Carbamate Mechanism (web-elaborated):</w:t>
+        <w:t>Specific Compounds Implicated in Indian Wildlife Poisoning:</w:t>
+      </w:r>
+    </w:p>
+    <w:tbl>
+      <w:tblPr>
+        <w:tblStyle w:val="TableGrid"/>
+        <w:tblW w:type="auto" w:w="0"/>
+        <w:tblLook w:firstColumn="1" w:firstRow="1" w:lastColumn="0" w:lastRow="0" w:noHBand="0" w:noVBand="1" w:val="04A0"/>
+      </w:tblPr>
+      <w:tblGrid>
+        <w:gridCol w:w="3213"/>
+        <w:gridCol w:w="3213"/>
+        <w:gridCol w:w="3213"/>
+      </w:tblGrid>
+      <w:tr>
+        <w:tc>
+          <w:tcPr>
+            <w:tcW w:type="dxa" w:w="1984"/>
+            <w:shd w:val="clear" w:color="auto" w:fill="2D6A4F"/>
+          </w:tcPr>
+          <w:p>
+            <w:pPr>
+              <w:jc w:val="center"/>
+            </w:pPr>
+            <w:r>
+              <w:rPr>
+                <w:rFonts w:ascii="Calibri" w:hAnsi="Calibri"/>
+                <w:b/>
+                <w:color w:val="FFFFFF"/>
+                <w:sz w:val="17"/>
+              </w:rPr>
+              <w:t>Compound</w:t>
+            </w:r>
+          </w:p>
+        </w:tc>
+        <w:tc>
+          <w:tcPr>
+            <w:tcW w:type="dxa" w:w="1417"/>
+            <w:shd w:val="clear" w:color="auto" w:fill="2D6A4F"/>
+          </w:tcPr>
+          <w:p>
+            <w:pPr>
+              <w:jc w:val="center"/>
+            </w:pPr>
+            <w:r>
+              <w:rPr>
+                <w:rFonts w:ascii="Calibri" w:hAnsi="Calibri"/>
+                <w:b/>
+                <w:color w:val="FFFFFF"/>
+                <w:sz w:val="17"/>
+              </w:rPr>
+              <w:t>Class</w:t>
+            </w:r>
+          </w:p>
+        </w:tc>
+        <w:tc>
+          <w:tcPr>
+            <w:tcW w:type="dxa" w:w="6236"/>
+            <w:shd w:val="clear" w:color="auto" w:fill="2D6A4F"/>
+          </w:tcPr>
+          <w:p>
+            <w:pPr>
+              <w:jc w:val="center"/>
+            </w:pPr>
+            <w:r>
+              <w:rPr>
+                <w:rFonts w:ascii="Calibri" w:hAnsi="Calibri"/>
+                <w:b/>
+                <w:color w:val="FFFFFF"/>
+                <w:sz w:val="17"/>
+              </w:rPr>
+              <w:t>Toxicity / Notes</w:t>
+            </w:r>
+          </w:p>
+        </w:tc>
+      </w:tr>
+      <w:tr>
+        <w:tc>
+          <w:tcPr>
+            <w:tcW w:type="dxa" w:w="1984"/>
+            <w:shd w:val="clear" w:color="auto" w:fill="FFFFFF"/>
+          </w:tcPr>
+          <w:p>
+            <w:r>
+              <w:rPr>
+                <w:rFonts w:ascii="Calibri" w:hAnsi="Calibri"/>
+                <w:b w:val="0"/>
+                <w:color w:val="1A1A1A"/>
+                <w:sz w:val="17"/>
+              </w:rPr>
+              <w:t>Carbofuran ("Furadan")</w:t>
+            </w:r>
+          </w:p>
+        </w:tc>
+        <w:tc>
+          <w:tcPr>
+            <w:tcW w:type="dxa" w:w="1417"/>
+            <w:shd w:val="clear" w:color="auto" w:fill="FFFFFF"/>
+          </w:tcPr>
+          <w:p>
+            <w:r>
+              <w:rPr>
+                <w:rFonts w:ascii="Calibri" w:hAnsi="Calibri"/>
+                <w:b w:val="0"/>
+                <w:color w:val="1A1A1A"/>
+                <w:sz w:val="17"/>
+              </w:rPr>
+              <w:t>Carbamate</w:t>
+            </w:r>
+          </w:p>
+        </w:tc>
+        <w:tc>
+          <w:tcPr>
+            <w:tcW w:type="dxa" w:w="6236"/>
+            <w:shd w:val="clear" w:color="auto" w:fill="FFFFFF"/>
+          </w:tcPr>
+          <w:p>
+            <w:r>
+              <w:rPr>
+                <w:rFonts w:ascii="Calibri" w:hAnsi="Calibri"/>
+                <w:b w:val="0"/>
+                <w:color w:val="1A1A1A"/>
+                <w:sz w:val="17"/>
+              </w:rPr>
+              <w:t>Granular; widely available (esp. Kerala); a LEADING agent in deliberate wildlife baiting</w:t>
+            </w:r>
+          </w:p>
+        </w:tc>
+      </w:tr>
+      <w:tr>
+        <w:tc>
+          <w:tcPr>
+            <w:tcW w:type="dxa" w:w="1984"/>
+            <w:shd w:val="clear" w:color="auto" w:fill="EAF7EE"/>
+          </w:tcPr>
+          <w:p>
+            <w:r>
+              <w:rPr>
+                <w:rFonts w:ascii="Calibri" w:hAnsi="Calibri"/>
+                <w:b w:val="0"/>
+                <w:color w:val="1A1A1A"/>
+                <w:sz w:val="17"/>
+              </w:rPr>
+              <w:t>Monocrotophos</w:t>
+            </w:r>
+          </w:p>
+        </w:tc>
+        <w:tc>
+          <w:tcPr>
+            <w:tcW w:type="dxa" w:w="1417"/>
+            <w:shd w:val="clear" w:color="auto" w:fill="EAF7EE"/>
+          </w:tcPr>
+          <w:p>
+            <w:r>
+              <w:rPr>
+                <w:rFonts w:ascii="Calibri" w:hAnsi="Calibri"/>
+                <w:b w:val="0"/>
+                <w:color w:val="1A1A1A"/>
+                <w:sz w:val="17"/>
+              </w:rPr>
+              <w:t>Organophosphate</w:t>
+            </w:r>
+          </w:p>
+        </w:tc>
+        <w:tc>
+          <w:tcPr>
+            <w:tcW w:type="dxa" w:w="6236"/>
+            <w:shd w:val="clear" w:color="auto" w:fill="EAF7EE"/>
+          </w:tcPr>
+          <w:p>
+            <w:r>
+              <w:rPr>
+                <w:rFonts w:ascii="Calibri" w:hAnsi="Calibri"/>
+                <w:b w:val="0"/>
+                <w:color w:val="1A1A1A"/>
+                <w:sz w:val="17"/>
+              </w:rPr>
+              <w:t>Highly toxic — mammalian oral LD50 ~18–20 mg/kg; common in Indian poisonings; used on grain baits</w:t>
+            </w:r>
+          </w:p>
+        </w:tc>
+      </w:tr>
+      <w:tr>
+        <w:tc>
+          <w:tcPr>
+            <w:tcW w:type="dxa" w:w="1984"/>
+            <w:shd w:val="clear" w:color="auto" w:fill="FFFFFF"/>
+          </w:tcPr>
+          <w:p>
+            <w:r>
+              <w:rPr>
+                <w:rFonts w:ascii="Calibri" w:hAnsi="Calibri"/>
+                <w:b w:val="0"/>
+                <w:color w:val="1A1A1A"/>
+                <w:sz w:val="17"/>
+              </w:rPr>
+              <w:t>Aldicarb ("Temik")</w:t>
+            </w:r>
+          </w:p>
+        </w:tc>
+        <w:tc>
+          <w:tcPr>
+            <w:tcW w:type="dxa" w:w="1417"/>
+            <w:shd w:val="clear" w:color="auto" w:fill="FFFFFF"/>
+          </w:tcPr>
+          <w:p>
+            <w:r>
+              <w:rPr>
+                <w:rFonts w:ascii="Calibri" w:hAnsi="Calibri"/>
+                <w:b w:val="0"/>
+                <w:color w:val="1A1A1A"/>
+                <w:sz w:val="17"/>
+              </w:rPr>
+              <w:t>Carbamate</w:t>
+            </w:r>
+          </w:p>
+        </w:tc>
+        <w:tc>
+          <w:tcPr>
+            <w:tcW w:type="dxa" w:w="6236"/>
+            <w:shd w:val="clear" w:color="auto" w:fill="FFFFFF"/>
+          </w:tcPr>
+          <w:p>
+            <w:r>
+              <w:rPr>
+                <w:rFonts w:ascii="Calibri" w:hAnsi="Calibri"/>
+                <w:b w:val="0"/>
+                <w:color w:val="1A1A1A"/>
+                <w:sz w:val="17"/>
+              </w:rPr>
+              <w:t>One of the MOST acutely toxic carbamates; used in baiting</w:t>
+            </w:r>
+          </w:p>
+        </w:tc>
+      </w:tr>
+      <w:tr>
+        <w:tc>
+          <w:tcPr>
+            <w:tcW w:type="dxa" w:w="1984"/>
+            <w:shd w:val="clear" w:color="auto" w:fill="EAF7EE"/>
+          </w:tcPr>
+          <w:p>
+            <w:r>
+              <w:rPr>
+                <w:rFonts w:ascii="Calibri" w:hAnsi="Calibri"/>
+                <w:b w:val="0"/>
+                <w:color w:val="1A1A1A"/>
+                <w:sz w:val="17"/>
+              </w:rPr>
+              <w:t>Chlorpyrifos</w:t>
+            </w:r>
+          </w:p>
+        </w:tc>
+        <w:tc>
+          <w:tcPr>
+            <w:tcW w:type="dxa" w:w="1417"/>
+            <w:shd w:val="clear" w:color="auto" w:fill="EAF7EE"/>
+          </w:tcPr>
+          <w:p>
+            <w:r>
+              <w:rPr>
+                <w:rFonts w:ascii="Calibri" w:hAnsi="Calibri"/>
+                <w:b w:val="0"/>
+                <w:color w:val="1A1A1A"/>
+                <w:sz w:val="17"/>
+              </w:rPr>
+              <w:t>Organophosphate</w:t>
+            </w:r>
+          </w:p>
+        </w:tc>
+        <w:tc>
+          <w:tcPr>
+            <w:tcW w:type="dxa" w:w="6236"/>
+            <w:shd w:val="clear" w:color="auto" w:fill="EAF7EE"/>
+          </w:tcPr>
+          <w:p>
+            <w:r>
+              <w:rPr>
+                <w:rFonts w:ascii="Calibri" w:hAnsi="Calibri"/>
+                <w:b w:val="0"/>
+                <w:color w:val="1A1A1A"/>
+                <w:sz w:val="17"/>
+              </w:rPr>
+              <w:t>Less acutely toxic (LD50 ~500 mg/kg goats); cattle/exotic breeds notably susceptible</w:t>
+            </w:r>
+          </w:p>
+        </w:tc>
+      </w:tr>
+      <w:tr>
+        <w:tc>
+          <w:tcPr>
+            <w:tcW w:type="dxa" w:w="1984"/>
+            <w:shd w:val="clear" w:color="auto" w:fill="FFFFFF"/>
+          </w:tcPr>
+          <w:p>
+            <w:r>
+              <w:rPr>
+                <w:rFonts w:ascii="Calibri" w:hAnsi="Calibri"/>
+                <w:b w:val="0"/>
+                <w:color w:val="1A1A1A"/>
+                <w:sz w:val="17"/>
+              </w:rPr>
+              <w:t>Imidacloprid</w:t>
+            </w:r>
+          </w:p>
+        </w:tc>
+        <w:tc>
+          <w:tcPr>
+            <w:tcW w:type="dxa" w:w="1417"/>
+            <w:shd w:val="clear" w:color="auto" w:fill="FFFFFF"/>
+          </w:tcPr>
+          <w:p>
+            <w:r>
+              <w:rPr>
+                <w:rFonts w:ascii="Calibri" w:hAnsi="Calibri"/>
+                <w:b w:val="0"/>
+                <w:color w:val="1A1A1A"/>
+                <w:sz w:val="17"/>
+              </w:rPr>
+              <w:t>Neonicotinoid</w:t>
+            </w:r>
+          </w:p>
+        </w:tc>
+        <w:tc>
+          <w:tcPr>
+            <w:tcW w:type="dxa" w:w="6236"/>
+            <w:shd w:val="clear" w:color="auto" w:fill="FFFFFF"/>
+          </w:tcPr>
+          <w:p>
+            <w:r>
+              <w:rPr>
+                <w:rFonts w:ascii="Calibri" w:hAnsi="Calibri"/>
+                <w:b w:val="0"/>
+                <w:color w:val="1A1A1A"/>
+                <w:sz w:val="17"/>
+              </w:rPr>
+              <w:t>Systemic insecticide; implicated in death of a wild adult Asian elephant (Kerala)</w:t>
+            </w:r>
+          </w:p>
+        </w:tc>
+      </w:tr>
+    </w:tbl>
+    <w:p>
+      <w:pPr>
+        <w:spacing w:after="40"/>
+      </w:pPr>
+    </w:p>
+    <w:p>
+      <w:pPr>
+        <w:spacing w:before="60" w:after="20"/>
+      </w:pPr>
+      <w:r>
+        <w:rPr>
+          <w:rFonts w:ascii="Calibri" w:hAnsi="Calibri"/>
+          <w:b/>
+          <w:color w:val="2D6A4F"/>
+          <w:sz w:val="20"/>
+        </w:rPr>
+        <w:t>OP vs Carbamate — Mechanism:</w:t>
       </w:r>
     </w:p>
     <w:p>
@@ -1861,7 +2764,7 @@
           <w:color w:val="1A1A1A"/>
           <w:sz w:val="19"/>
         </w:rPr>
-        <w:t>◦  Inhibit acetylcholinesterase (AChE) enzyme → accumulation of acetylcholine at synapses</w:t>
+        <w:t>◦  BOTH inhibit acetylcholinesterase (AChE) → acetylcholine accumulates at muscarinic, nicotinic and CNS synapses</w:t>
       </w:r>
     </w:p>
     <w:p>
@@ -1875,7 +2778,21 @@
           <w:color w:val="1A1A1A"/>
           <w:sz w:val="19"/>
         </w:rPr>
-        <w:t>◦  Cholinergic crisis: SLUDGE signs — Salivation, Lacrimation, Urination, Defecation, GI distress, Emesis</w:t>
+        <w:t>◦  OPs PHOSPHORYLATE AChE — binding becomes irreversible after "aging" (hours); carbamates CARBAMYLATE AChE reversibly — toxicity self-limiting (&lt;24 h) if animal survives</w:t>
+      </w:r>
+    </w:p>
+    <w:p>
+      <w:pPr>
+        <w:spacing w:before="60" w:after="20"/>
+      </w:pPr>
+      <w:r>
+        <w:rPr>
+          <w:rFonts w:ascii="Calibri" w:hAnsi="Calibri"/>
+          <w:b/>
+          <w:color w:val="2D6A4F"/>
+          <w:sz w:val="20"/>
+        </w:rPr>
+        <w:t>Clinical Signs — Cholinergic Toxidrome (DUMBELS):</w:t>
       </w:r>
     </w:p>
     <w:p>
@@ -1889,7 +2806,7 @@
           <w:color w:val="1A1A1A"/>
           <w:sz w:val="19"/>
         </w:rPr>
-        <w:t>◦  Muscarinic: miosis (pinpoint pupils), bronchorrhoea, bradycardia; Nicotinic: muscle fasciculation, paralysis</w:t>
+        <w:t>◦  MUSCARINIC: Defecation, Urination, Miosis (pinpoint pupils), Bronchorrhoea/Bronchoconstriction, Emesis, Lacrimation, Salivation; bradycardia</w:t>
       </w:r>
     </w:p>
     <w:p>
@@ -1903,7 +2820,7 @@
           <w:color w:val="1A1A1A"/>
           <w:sz w:val="19"/>
         </w:rPr>
-        <w:t>◦  Death from respiratory failure (bronchoconstriction + respiratory muscle paralysis + central depression)</w:t>
+        <w:t>◦  NICOTINIC: muscle fasciculations, tremors, weakness, flaccid paralysis</w:t>
       </w:r>
     </w:p>
     <w:p>
@@ -1917,7 +2834,105 @@
           <w:color w:val="1A1A1A"/>
           <w:sz w:val="19"/>
         </w:rPr>
-        <w:t>◦  ANTIDOTE: Atropine sulphate (blocks muscarinic effects) + Pralidoxime/2-PAM (reactivates AChE — OP only, not carbamate)</w:t>
+        <w:t>◦  CNS: depression, ataxia, seizures; DEATH from respiratory failure</w:t>
+      </w:r>
+    </w:p>
+    <w:p>
+      <w:pPr>
+        <w:spacing w:before="60" w:after="20"/>
+      </w:pPr>
+      <w:r>
+        <w:rPr>
+          <w:rFonts w:ascii="Calibri" w:hAnsi="Calibri"/>
+          <w:b/>
+          <w:color w:val="2D6A4F"/>
+          <w:sz w:val="20"/>
+        </w:rPr>
+        <w:t>Diagnosis:</w:t>
+      </w:r>
+    </w:p>
+    <w:p>
+      <w:pPr>
+        <w:spacing w:after="40"/>
+        <w:ind w:left="567" w:hanging="170"/>
+      </w:pPr>
+      <w:r>
+        <w:rPr>
+          <w:rFonts w:ascii="Calibri" w:hAnsi="Calibri"/>
+          <w:color w:val="1A1A1A"/>
+          <w:sz w:val="19"/>
+        </w:rPr>
+        <w:t>◦  Cholinesterase (ChE) activity in whole blood, BRAIN and retina — brain AChE depression to &lt;50% of normal is DIAGNOSTIC</w:t>
+      </w:r>
+    </w:p>
+    <w:p>
+      <w:pPr>
+        <w:spacing w:after="40"/>
+        <w:ind w:left="567" w:hanging="170"/>
+      </w:pPr>
+      <w:r>
+        <w:rPr>
+          <w:rFonts w:ascii="Calibri" w:hAnsi="Calibri"/>
+          <w:color w:val="1A1A1A"/>
+          <w:sz w:val="19"/>
+        </w:rPr>
+        <w:t>◦  Detect parent compound in stomach contents, liver, and bait material (GC-MS / LC-MS)</w:t>
+      </w:r>
+    </w:p>
+    <w:p>
+      <w:pPr>
+        <w:spacing w:after="40"/>
+        <w:ind w:left="567" w:hanging="170"/>
+      </w:pPr>
+      <w:r>
+        <w:rPr>
+          <w:rFonts w:ascii="Calibri" w:hAnsi="Calibri"/>
+          <w:color w:val="1A1A1A"/>
+          <w:sz w:val="19"/>
+        </w:rPr>
+        <w:t>◦  CRITICAL: carbamate-inhibited ChE spontaneously reactivates — freeze samples FAST and analyse promptly to avoid false negatives</w:t>
+      </w:r>
+    </w:p>
+    <w:p>
+      <w:pPr>
+        <w:spacing w:before="60" w:after="20"/>
+      </w:pPr>
+      <w:r>
+        <w:rPr>
+          <w:rFonts w:ascii="Calibri" w:hAnsi="Calibri"/>
+          <w:b/>
+          <w:color w:val="2D6A4F"/>
+          <w:sz w:val="20"/>
+        </w:rPr>
+        <w:t>Antidote Dosing (cattle/large-animal reference — extrapolate for elephant):</w:t>
+      </w:r>
+    </w:p>
+    <w:p>
+      <w:pPr>
+        <w:spacing w:after="40"/>
+        <w:ind w:left="567" w:hanging="170"/>
+      </w:pPr>
+      <w:r>
+        <w:rPr>
+          <w:rFonts w:ascii="Calibri" w:hAnsi="Calibri"/>
+          <w:color w:val="1A1A1A"/>
+          <w:sz w:val="19"/>
+        </w:rPr>
+        <w:t>◦  ATROPINE: 0.6–1.0 mg/kg (cattle) — give ~⅓ IV, remainder IM/SC; repeat to effect ("atropinisation": pupil dilation, drying secretions, alertness)</w:t>
+      </w:r>
+    </w:p>
+    <w:p>
+      <w:pPr>
+        <w:spacing w:after="40"/>
+        <w:ind w:left="567" w:hanging="170"/>
+      </w:pPr>
+      <w:r>
+        <w:rPr>
+          <w:rFonts w:ascii="Calibri" w:hAnsi="Calibri"/>
+          <w:color w:val="1A1A1A"/>
+          <w:sz w:val="19"/>
+        </w:rPr>
+        <w:t>◦  PRALIDOXIME (2-PAM): 20–50 mg/kg as 5% solution, slow IV (5–10 min) or IM — reactivates AChE; MUST be given EARLY (before aging); effective for OPs, generally not for carbamates</w:t>
       </w:r>
     </w:p>
     <w:tbl>
@@ -2506,6 +3521,160 @@
           <w:color w:val="2D6A4F"/>
           <w:sz w:val="20"/>
         </w:rPr>
+        <w:t>What the Forensic Investigation Found (verified):</w:t>
+      </w:r>
+    </w:p>
+    <w:p>
+      <w:pPr>
+        <w:spacing w:after="40"/>
+        <w:ind w:left="283" w:hanging="170"/>
+      </w:pPr>
+      <w:r>
+        <w:rPr>
+          <w:rFonts w:ascii="Calibri" w:hAnsi="Calibri"/>
+          <w:color w:val="1A1A1A"/>
+          <w:sz w:val="19"/>
+        </w:rPr>
+        <w:t>•  Confirmed event: 10 wild elephants died over 3 days (29–31 October 2024) in Sankhani/Bakeli, Khitoli range, Bandhavgarh Tiger Reserve, Madhya Pradesh</w:t>
+      </w:r>
+    </w:p>
+    <w:p>
+      <w:pPr>
+        <w:spacing w:after="40"/>
+        <w:ind w:left="283" w:hanging="170"/>
+      </w:pPr>
+      <w:r>
+        <w:rPr>
+          <w:rFonts w:ascii="Calibri" w:hAnsi="Calibri"/>
+          <w:color w:val="1A1A1A"/>
+          <w:sz w:val="19"/>
+        </w:rPr>
+        <w:t>•  Samples (viscera, liver, kidney) sent to ICAR-IVRI Bareilly, WII Dehradun, MP State FSL Sagar, and CCMB Hyderabad</w:t>
+      </w:r>
+    </w:p>
+    <w:p>
+      <w:pPr>
+        <w:spacing w:after="40"/>
+        <w:ind w:left="283" w:hanging="170"/>
+      </w:pPr>
+      <w:r>
+        <w:rPr>
+          <w:rFonts w:ascii="Calibri" w:hAnsi="Calibri"/>
+          <w:color w:val="1A1A1A"/>
+          <w:sz w:val="19"/>
+        </w:rPr>
+        <w:t>•  IVRI toxicology report (5 Nov 2024): NO nitrates/nitrites, NO heavy metals, and NO pesticides (OP, organochlorine, pyrethroid, carbamate) detected</w:t>
+      </w:r>
+    </w:p>
+    <w:p>
+      <w:pPr>
+        <w:spacing w:after="40"/>
+        <w:ind w:left="283" w:hanging="170"/>
+      </w:pPr>
+      <w:r>
+        <w:rPr>
+          <w:rFonts w:ascii="Calibri" w:hAnsi="Calibri"/>
+          <w:color w:val="1A1A1A"/>
+          <w:sz w:val="19"/>
+        </w:rPr>
+        <w:t>•  CYCLOPIAZONIC ACID (CPA) was CONFIRMED in the viscera of all elephants → diagnosis: ingestion of large quantities of FUNGUS-INFECTED Kodo millet</w:t>
+      </w:r>
+    </w:p>
+    <w:p>
+      <w:pPr>
+        <w:spacing w:after="40"/>
+        <w:ind w:left="283" w:hanging="170"/>
+      </w:pPr>
+      <w:r>
+        <w:rPr>
+          <w:rFonts w:ascii="Calibri" w:hAnsi="Calibri"/>
+          <w:color w:val="1A1A1A"/>
+          <w:sz w:val="19"/>
+        </w:rPr>
+        <w:t>•  Key nuance: the FUNGUS (toxin) on the millet — not the millet grain itself — was the proximate cause ("fungus, not Kodo millet, responsible")</w:t>
+      </w:r>
+    </w:p>
+    <w:p>
+      <w:pPr>
+        <w:spacing w:before="60" w:after="20"/>
+      </w:pPr>
+      <w:r>
+        <w:rPr>
+          <w:rFonts w:ascii="Calibri" w:hAnsi="Calibri"/>
+          <w:b/>
+          <w:color w:val="2D6A4F"/>
+          <w:sz w:val="20"/>
+        </w:rPr>
+        <w:t>CPA Mechanism &amp; Pathology (web-elaborated):</w:t>
+      </w:r>
+    </w:p>
+    <w:p>
+      <w:pPr>
+        <w:spacing w:after="40"/>
+        <w:ind w:left="283" w:hanging="170"/>
+      </w:pPr>
+      <w:r>
+        <w:rPr>
+          <w:rFonts w:ascii="Calibri" w:hAnsi="Calibri"/>
+          <w:color w:val="1A1A1A"/>
+          <w:sz w:val="19"/>
+        </w:rPr>
+        <w:t>•  CPA is an indole-tetramic acid mycotoxin from Aspergillus flavus, A. tamarii and Penicillium spp. infesting Kodo millet</w:t>
+      </w:r>
+    </w:p>
+    <w:p>
+      <w:pPr>
+        <w:spacing w:after="40"/>
+        <w:ind w:left="283" w:hanging="170"/>
+      </w:pPr>
+      <w:r>
+        <w:rPr>
+          <w:rFonts w:ascii="Calibri" w:hAnsi="Calibri"/>
+          <w:color w:val="1A1A1A"/>
+          <w:sz w:val="19"/>
+        </w:rPr>
+        <w:t>•  Mechanism: potent inhibitor of Ca²⁺-dependent ATPases (SERCA) of the endo/sarcoplasmic reticulum → disrupts intracellular calcium gradients and the muscle contraction–relaxation cycle</w:t>
+      </w:r>
+    </w:p>
+    <w:p>
+      <w:pPr>
+        <w:spacing w:after="40"/>
+        <w:ind w:left="283" w:hanging="170"/>
+      </w:pPr>
+      <w:r>
+        <w:rPr>
+          <w:rFonts w:ascii="Calibri" w:hAnsi="Calibri"/>
+          <w:color w:val="1A1A1A"/>
+          <w:sz w:val="19"/>
+        </w:rPr>
+        <w:t>•  Effects: acute HEPATOTOXICITY, nephrotoxicity, and GI-tract effects; vascular damage; neurological signs (depression, loss of mobility)</w:t>
+      </w:r>
+    </w:p>
+    <w:p>
+      <w:pPr>
+        <w:spacing w:after="40"/>
+        <w:ind w:left="283" w:hanging="170"/>
+      </w:pPr>
+      <w:r>
+        <w:rPr>
+          <w:rFonts w:ascii="Calibri" w:hAnsi="Calibri"/>
+          <w:color w:val="1A1A1A"/>
+          <w:sz w:val="19"/>
+        </w:rPr>
+        <w:t>•  AFLATOXINS (related): Aspergillus flavus/parasiticus on grain — hepatotoxic/hepatocarcinogenic; hepatic necrosis, bile-duct proliferation, icterus, coagulopathy — a key differential in grain-associated die-offs</w:t>
+      </w:r>
+    </w:p>
+    <w:p>
+      <w:pPr>
+        <w:spacing w:before="60" w:after="20"/>
+      </w:pPr>
+      <w:r>
+        <w:rPr>
+          <w:rFonts w:ascii="Calibri" w:hAnsi="Calibri"/>
+          <w:b/>
+          <w:color w:val="2D6A4F"/>
+          <w:sz w:val="20"/>
+        </w:rPr>
         <w:t>Management of Kodo Millet Toxicity:</w:t>
       </w:r>
     </w:p>
@@ -3054,7 +4223,35 @@
           <w:color w:val="1A1A1A"/>
           <w:sz w:val="19"/>
         </w:rPr>
-        <w:t>•  Result: cells cannot use oxygen despite adequate blood oxygen → death by internal asphyxiation (histotoxic hypoxia)</w:t>
+        <w:t>•  Result: cells cannot use oxygen despite adequate blood oxygen → "histotoxic hypoxia" → forced anaerobic metabolism → profound LACTIC ACIDOSIS → death</w:t>
+      </w:r>
+    </w:p>
+    <w:p>
+      <w:pPr>
+        <w:spacing w:after="40"/>
+        <w:ind w:left="283" w:hanging="170"/>
+      </w:pPr>
+      <w:r>
+        <w:rPr>
+          <w:rFonts w:ascii="Calibri" w:hAnsi="Calibri"/>
+          <w:color w:val="1A1A1A"/>
+          <w:sz w:val="19"/>
+        </w:rPr>
+        <w:t>•  Approximate lethal dose (general mammalian): ~2–2.5 mg cyanide/kg body weight; onset within ~15–20 min</w:t>
+      </w:r>
+    </w:p>
+    <w:p>
+      <w:pPr>
+        <w:spacing w:after="40"/>
+        <w:ind w:left="283" w:hanging="170"/>
+      </w:pPr>
+      <w:r>
+        <w:rPr>
+          <w:rFonts w:ascii="Calibri" w:hAnsi="Calibri"/>
+          <w:color w:val="1A1A1A"/>
+          <w:sz w:val="19"/>
+        </w:rPr>
+        <w:t>•  CAUTION at necropsy: the classic cherry-red colour FADES rapidly after death and air exposure — it is SUGGESTIVE, not confirmatory; mucous membranes may turn cyanotic once respiration stops</w:t>
       </w:r>
     </w:p>
     <w:tbl>
@@ -4082,7 +5279,7 @@
                 <w:color w:val="FFFFFF"/>
                 <w:sz w:val="21"/>
               </w:rPr>
-              <w:t>6.2  Electrocution in Indian Elephants — Context</w:t>
+              <w:t>6.2  Electrocution in Indian Elephants — Statistics</w:t>
             </w:r>
           </w:p>
         </w:tc>
@@ -4104,7 +5301,7 @@
           <w:color w:val="1A1A1A"/>
           <w:sz w:val="19"/>
         </w:rPr>
-        <w:t>•  Electrocution is the LEADING cause of unnatural elephant death in India (~70–75% of unnatural deaths in recent national data)</w:t>
+        <w:t>•  Electrocution is the SINGLE LARGEST cause of unnatural elephant death in India</w:t>
       </w:r>
     </w:p>
     <w:p>
@@ -4118,7 +5315,7 @@
           <w:color w:val="1A1A1A"/>
           <w:sz w:val="19"/>
         </w:rPr>
-        <w:t>•  Sources: illegal live wires hung low around crop fields (deliberate, for crop protection or poaching); sagging/low-hanging 11 kV power transmission lines; solar fence tampering</w:t>
+        <w:t>•  Lok Sabha (July 2024): 392 of 528 unnatural deaths (74%) over 5 years were electrocution</w:t>
       </w:r>
     </w:p>
     <w:p>
@@ -4132,7 +5329,35 @@
           <w:color w:val="1A1A1A"/>
           <w:sz w:val="19"/>
         </w:rPr>
-        <w:t>•  Both INTENTIONAL (poaching, conflict retaliation) and ACCIDENTAL (sagging legal power lines) electrocutions occur</w:t>
+        <w:t>•  2010–2020: electrocution killed 741 of 1,160 (≈64%) non-natural deaths; long-run share since 2009 ≈ 67%</w:t>
+      </w:r>
+    </w:p>
+    <w:p>
+      <w:pPr>
+        <w:spacing w:after="40"/>
+        <w:ind w:left="283" w:hanging="170"/>
+      </w:pPr>
+      <w:r>
+        <w:rPr>
+          <w:rFonts w:ascii="Calibri" w:hAnsi="Calibri"/>
+          <w:color w:val="1A1A1A"/>
+          <w:sz w:val="19"/>
+        </w:rPr>
+        <w:t>•  State-wise (2024 dataset): Odisha 71, Assam 55, Karnataka 52, Tamil Nadu 49, Chhattisgarh 32, Jharkhand 30, Kerala 29</w:t>
+      </w:r>
+    </w:p>
+    <w:p>
+      <w:pPr>
+        <w:spacing w:after="40"/>
+        <w:ind w:left="283" w:hanging="170"/>
+      </w:pPr>
+      <w:r>
+        <w:rPr>
+          <w:rFonts w:ascii="Calibri" w:hAnsi="Calibri"/>
+          <w:color w:val="1A1A1A"/>
+          <w:sz w:val="19"/>
+        </w:rPr>
+        <w:t>•  NOTE: headline 5-year figures (e.g., 348 in 2022 vs 392 in 2024) come from different reporting windows — do not sum across statements</w:t>
       </w:r>
     </w:p>
     <w:tbl>
@@ -4161,7 +5386,7 @@
                 <w:color w:val="FFFFFF"/>
                 <w:sz w:val="21"/>
               </w:rPr>
-              <w:t>6.3  Postmortem Findings in Electrocution (web-elaborated)</w:t>
+              <w:t>6.3  Sources &amp; Mechanisms</w:t>
             </w:r>
           </w:p>
         </w:tc>
@@ -4172,6 +5397,245 @@
         <w:spacing w:after="40"/>
       </w:pPr>
     </w:p>
+    <w:tbl>
+      <w:tblPr>
+        <w:tblStyle w:val="TableGrid"/>
+        <w:tblW w:type="auto" w:w="0"/>
+        <w:tblLook w:firstColumn="1" w:firstRow="1" w:lastColumn="0" w:lastRow="0" w:noHBand="0" w:noVBand="1" w:val="04A0"/>
+      </w:tblPr>
+      <w:tblGrid>
+        <w:gridCol w:w="4819"/>
+        <w:gridCol w:w="4819"/>
+      </w:tblGrid>
+      <w:tr>
+        <w:tc>
+          <w:tcPr>
+            <w:tcW w:type="dxa" w:w="2268"/>
+            <w:shd w:val="clear" w:color="auto" w:fill="2D6A4F"/>
+          </w:tcPr>
+          <w:p>
+            <w:pPr>
+              <w:jc w:val="center"/>
+            </w:pPr>
+            <w:r>
+              <w:rPr>
+                <w:rFonts w:ascii="Calibri" w:hAnsi="Calibri"/>
+                <w:b/>
+                <w:color w:val="FFFFFF"/>
+                <w:sz w:val="17"/>
+              </w:rPr>
+              <w:t>Source</w:t>
+            </w:r>
+          </w:p>
+        </w:tc>
+        <w:tc>
+          <w:tcPr>
+            <w:tcW w:type="dxa" w:w="7370"/>
+            <w:shd w:val="clear" w:color="auto" w:fill="2D6A4F"/>
+          </w:tcPr>
+          <w:p>
+            <w:pPr>
+              <w:jc w:val="center"/>
+            </w:pPr>
+            <w:r>
+              <w:rPr>
+                <w:rFonts w:ascii="Calibri" w:hAnsi="Calibri"/>
+                <w:b/>
+                <w:color w:val="FFFFFF"/>
+                <w:sz w:val="17"/>
+              </w:rPr>
+              <w:t>Description</w:t>
+            </w:r>
+          </w:p>
+        </w:tc>
+      </w:tr>
+      <w:tr>
+        <w:tc>
+          <w:tcPr>
+            <w:tcW w:type="dxa" w:w="2268"/>
+            <w:shd w:val="clear" w:color="auto" w:fill="FFFFFF"/>
+          </w:tcPr>
+          <w:p>
+            <w:r>
+              <w:rPr>
+                <w:rFonts w:ascii="Calibri" w:hAnsi="Calibri"/>
+                <w:b w:val="0"/>
+                <w:color w:val="1A1A1A"/>
+                <w:sz w:val="17"/>
+              </w:rPr>
+              <w:t>Illegal live-wire fences</w:t>
+            </w:r>
+          </w:p>
+        </w:tc>
+        <w:tc>
+          <w:tcPr>
+            <w:tcW w:type="dxa" w:w="7370"/>
+            <w:shd w:val="clear" w:color="auto" w:fill="FFFFFF"/>
+          </w:tcPr>
+          <w:p>
+            <w:r>
+              <w:rPr>
+                <w:rFonts w:ascii="Calibri" w:hAnsi="Calibri"/>
+                <w:b w:val="0"/>
+                <w:color w:val="1A1A1A"/>
+                <w:sz w:val="17"/>
+              </w:rPr>
+              <w:t>Power illegally tapped ("hooking") from 11 kV HT or LT lines to electrify crop/home fences — the LEADING driver; deliberate, sometimes for poaching</w:t>
+            </w:r>
+          </w:p>
+        </w:tc>
+      </w:tr>
+      <w:tr>
+        <w:tc>
+          <w:tcPr>
+            <w:tcW w:type="dxa" w:w="2268"/>
+            <w:shd w:val="clear" w:color="auto" w:fill="EAF7EE"/>
+          </w:tcPr>
+          <w:p>
+            <w:r>
+              <w:rPr>
+                <w:rFonts w:ascii="Calibri" w:hAnsi="Calibri"/>
+                <w:b w:val="0"/>
+                <w:color w:val="1A1A1A"/>
+                <w:sz w:val="17"/>
+              </w:rPr>
+              <w:t>Sagging overhead lines</w:t>
+            </w:r>
+          </w:p>
+        </w:tc>
+        <w:tc>
+          <w:tcPr>
+            <w:tcW w:type="dxa" w:w="7370"/>
+            <w:shd w:val="clear" w:color="auto" w:fill="EAF7EE"/>
+          </w:tcPr>
+          <w:p>
+            <w:r>
+              <w:rPr>
+                <w:rFonts w:ascii="Calibri" w:hAnsi="Calibri"/>
+                <w:b w:val="0"/>
+                <w:color w:val="1A1A1A"/>
+                <w:sz w:val="17"/>
+              </w:rPr>
+              <w:t>Low-hanging 11 kV lines (observed as low as ~1.5 m vs an ~3.3 m tall elephant) due to wide pole spacing, base erosion, waterlogging</w:t>
+            </w:r>
+          </w:p>
+        </w:tc>
+      </w:tr>
+      <w:tr>
+        <w:tc>
+          <w:tcPr>
+            <w:tcW w:type="dxa" w:w="2268"/>
+            <w:shd w:val="clear" w:color="auto" w:fill="FFFFFF"/>
+          </w:tcPr>
+          <w:p>
+            <w:r>
+              <w:rPr>
+                <w:rFonts w:ascii="Calibri" w:hAnsi="Calibri"/>
+                <w:b w:val="0"/>
+                <w:color w:val="1A1A1A"/>
+                <w:sz w:val="17"/>
+              </w:rPr>
+              <w:t>Solar-fence tampering</w:t>
+            </w:r>
+          </w:p>
+        </w:tc>
+        <w:tc>
+          <w:tcPr>
+            <w:tcW w:type="dxa" w:w="7370"/>
+            <w:shd w:val="clear" w:color="auto" w:fill="FFFFFF"/>
+          </w:tcPr>
+          <w:p>
+            <w:r>
+              <w:rPr>
+                <w:rFonts w:ascii="Calibri" w:hAnsi="Calibri"/>
+                <w:b w:val="0"/>
+                <w:color w:val="1A1A1A"/>
+                <w:sz w:val="17"/>
+              </w:rPr>
+              <w:t>Bypassing the low-current pulsed energiser and connecting fence wire directly to mains — turns a legal, non-lethal deterrent into a lethal trap</w:t>
+            </w:r>
+          </w:p>
+        </w:tc>
+      </w:tr>
+      <w:tr>
+        <w:tc>
+          <w:tcPr>
+            <w:tcW w:type="dxa" w:w="2268"/>
+            <w:shd w:val="clear" w:color="auto" w:fill="EAF7EE"/>
+          </w:tcPr>
+          <w:p>
+            <w:r>
+              <w:rPr>
+                <w:rFonts w:ascii="Calibri" w:hAnsi="Calibri"/>
+                <w:b w:val="0"/>
+                <w:color w:val="1A1A1A"/>
+                <w:sz w:val="17"/>
+              </w:rPr>
+              <w:t>Accidental (legal lines)</w:t>
+            </w:r>
+          </w:p>
+        </w:tc>
+        <w:tc>
+          <w:tcPr>
+            <w:tcW w:type="dxa" w:w="7370"/>
+            <w:shd w:val="clear" w:color="auto" w:fill="EAF7EE"/>
+          </w:tcPr>
+          <w:p>
+            <w:r>
+              <w:rPr>
+                <w:rFonts w:ascii="Calibri" w:hAnsi="Calibri"/>
+                <w:b w:val="0"/>
+                <w:color w:val="1A1A1A"/>
+                <w:sz w:val="17"/>
+              </w:rPr>
+              <w:t>Genuine accidental contact with sagging but legally installed transmission infrastructure in corridors</w:t>
+            </w:r>
+          </w:p>
+        </w:tc>
+      </w:tr>
+    </w:tbl>
+    <w:p>
+      <w:pPr>
+        <w:spacing w:after="40"/>
+      </w:pPr>
+    </w:p>
+    <w:tbl>
+      <w:tblPr>
+        <w:tblStyle w:val="TableGrid"/>
+        <w:tblW w:type="auto" w:w="0"/>
+        <w:tblLook w:firstColumn="1" w:firstRow="1" w:lastColumn="0" w:lastRow="0" w:noHBand="0" w:noVBand="1" w:val="04A0"/>
+      </w:tblPr>
+      <w:tblGrid>
+        <w:gridCol w:w="9638"/>
+      </w:tblGrid>
+      <w:tr>
+        <w:tc>
+          <w:tcPr>
+            <w:tcW w:type="dxa" w:w="9638"/>
+            <w:shd w:val="clear" w:color="auto" w:fill="2D6A4F"/>
+          </w:tcPr>
+          <w:p>
+            <w:pPr>
+              <w:spacing w:before="80" w:after="80"/>
+            </w:pPr>
+            <w:r>
+              <w:rPr>
+                <w:rFonts w:ascii="Calibri" w:hAnsi="Calibri"/>
+                <w:b/>
+                <w:color w:val="FFFFFF"/>
+                <w:sz w:val="21"/>
+              </w:rPr>
+              <w:t>6.4  Postmortem / Necropsy Findings</w:t>
+            </w:r>
+          </w:p>
+        </w:tc>
+      </w:tr>
+    </w:tbl>
+    <w:p>
+      <w:pPr>
+        <w:spacing w:after="40"/>
+      </w:pPr>
+    </w:p>
     <w:p>
       <w:pPr>
         <w:spacing w:after="40"/>
@@ -4183,7 +5647,7 @@
           <w:color w:val="1A1A1A"/>
           <w:sz w:val="19"/>
         </w:rPr>
-        <w:t>•  ELECTRICAL BURN MARKS (Joule burns): focal, often at the trunk tip, ear, shoulder, or feet — point of contact with the wire; singed skin, charring, crater-like lesions</w:t>
+        <w:t>•  CURRENT MARK / ELECTRIC MARK (gross "gold standard"): crater-like skin elevation around a sunken pale centre at the contact point — trunk tip, feet, dorsum</w:t>
       </w:r>
     </w:p>
     <w:p>
@@ -4197,7 +5661,7 @@
           <w:color w:val="1A1A1A"/>
           <w:sz w:val="19"/>
         </w:rPr>
-        <w:t>•  CURRENT MARKS: characteristic blistering/charring at entry and exit points</w:t>
+        <w:t>•  JOULE BURN: heat-generated burn — collagen denaturation + dermal oedema; singed hair; Grade III–IV burns, blistering, bone/muscle exposure</w:t>
       </w:r>
     </w:p>
     <w:p>
@@ -4211,7 +5675,7 @@
           <w:color w:val="1A1A1A"/>
           <w:sz w:val="19"/>
         </w:rPr>
-        <w:t>•  Subcutaneous and intramuscular HAEMORRHAGE along the current path</w:t>
+        <w:t>•  METALLIZATION: microscopic conductor-metal particles deposited in skin at contact — reported in &gt;50% of cases (detectable histochemically/SEM)</w:t>
       </w:r>
     </w:p>
     <w:p>
@@ -4225,7 +5689,7 @@
           <w:color w:val="1A1A1A"/>
           <w:sz w:val="19"/>
         </w:rPr>
-        <w:t>•  Internal: pulmonary congestion and oedema; petechial haemorrhages on heart (epicardium/endocardium); generalised venous congestion</w:t>
+        <w:t>•  HISTOPATHOLOGY: coagulative necrosis of epidermis; intra/sub-epidermal clefting; "NUCLEAR STREAMING" — elongation, palisading and hyperchromasia of basal epidermal nuclei aligned to current flow; dermal collagen homogenisation</w:t>
       </w:r>
     </w:p>
     <w:p>
@@ -4239,7 +5703,7 @@
           <w:color w:val="1A1A1A"/>
           <w:sz w:val="19"/>
         </w:rPr>
-        <w:t>•  Carcass often found near a known electrical source (fence line, power pole, field boundary)</w:t>
+        <w:t>•  INTERNAL: generalised visceral congestion (brain, heart, lungs); pulmonary oedema; sub-epicardial/endocardial petechiae; myocardial necrosis; rhabdomyolysis; slow-clotting dark blood; bloody orifice discharge</w:t>
       </w:r>
     </w:p>
     <w:p>
@@ -4253,7 +5717,537 @@
           <w:color w:val="1A1A1A"/>
           <w:sz w:val="19"/>
         </w:rPr>
-        <w:t>•  Dr. Shrivastava note: "Experience — charcoal powder" — charred tissue at the contact site has a charcoal-like appearance; histology confirms thermal/electrical coagulative necrosis</w:t>
+        <w:t>•  Dr. Shrivastava note: "Experience — charcoal powder" — charred contact tissue has a charcoal-like appearance</w:t>
+      </w:r>
+    </w:p>
+    <w:p>
+      <w:pPr>
+        <w:spacing w:after="40"/>
+        <w:ind w:left="283" w:hanging="170"/>
+      </w:pPr>
+      <w:r>
+        <w:rPr>
+          <w:rFonts w:ascii="Calibri" w:hAnsi="Calibri"/>
+          <w:color w:val="1A1A1A"/>
+          <w:sz w:val="19"/>
+        </w:rPr>
+        <w:t>•  CAVEAT: nuclear streaming and coagulative necrosis are NOT pathognomonic (also seen in flame/thermal burns); gross lesions may be ABSENT if contact area is wide or skin is wet — diagnosis leans on lesion + scene/circumstantial evidence</w:t>
+      </w:r>
+    </w:p>
+    <w:p>
+      <w:pPr>
+        <w:spacing w:after="40"/>
+        <w:ind w:left="283" w:hanging="170"/>
+      </w:pPr>
+      <w:r>
+        <w:rPr>
+          <w:rFonts w:ascii="Calibri" w:hAnsi="Calibri"/>
+          <w:color w:val="1A1A1A"/>
+          <w:sz w:val="19"/>
+        </w:rPr>
+        <w:t>•  Reference: Schulze C et al. (2016). Electrical Injuries in Animals: Causes, Pathogenesis, and Morphological Findings. Veterinary Pathology</w:t>
+      </w:r>
+    </w:p>
+    <w:tbl>
+      <w:tblPr>
+        <w:tblStyle w:val="TableGrid"/>
+        <w:tblW w:type="auto" w:w="0"/>
+        <w:tblLook w:firstColumn="1" w:firstRow="1" w:lastColumn="0" w:lastRow="0" w:noHBand="0" w:noVBand="1" w:val="04A0"/>
+      </w:tblPr>
+      <w:tblGrid>
+        <w:gridCol w:w="9638"/>
+      </w:tblGrid>
+      <w:tr>
+        <w:tc>
+          <w:tcPr>
+            <w:tcW w:type="dxa" w:w="9638"/>
+            <w:shd w:val="clear" w:color="auto" w:fill="2D6A4F"/>
+          </w:tcPr>
+          <w:p>
+            <w:pPr>
+              <w:spacing w:before="80" w:after="80"/>
+            </w:pPr>
+            <w:r>
+              <w:rPr>
+                <w:rFonts w:ascii="Calibri" w:hAnsi="Calibri"/>
+                <w:b/>
+                <w:color w:val="FFFFFF"/>
+                <w:sz w:val="21"/>
+              </w:rPr>
+              <w:t>6.5  Lightning Strike vs Man-Made Electrocution</w:t>
+            </w:r>
+          </w:p>
+        </w:tc>
+      </w:tr>
+    </w:tbl>
+    <w:p>
+      <w:pPr>
+        <w:spacing w:after="40"/>
+      </w:pPr>
+    </w:p>
+    <w:tbl>
+      <w:tblPr>
+        <w:tblStyle w:val="TableGrid"/>
+        <w:tblW w:type="auto" w:w="0"/>
+        <w:tblLook w:firstColumn="1" w:firstRow="1" w:lastColumn="0" w:lastRow="0" w:noHBand="0" w:noVBand="1" w:val="04A0"/>
+      </w:tblPr>
+      <w:tblGrid>
+        <w:gridCol w:w="3213"/>
+        <w:gridCol w:w="3213"/>
+        <w:gridCol w:w="3213"/>
+      </w:tblGrid>
+      <w:tr>
+        <w:tc>
+          <w:tcPr>
+            <w:tcW w:type="dxa" w:w="1701"/>
+            <w:shd w:val="clear" w:color="auto" w:fill="2D6A4F"/>
+          </w:tcPr>
+          <w:p>
+            <w:pPr>
+              <w:jc w:val="center"/>
+            </w:pPr>
+            <w:r>
+              <w:rPr>
+                <w:rFonts w:ascii="Calibri" w:hAnsi="Calibri"/>
+                <w:b/>
+                <w:color w:val="FFFFFF"/>
+                <w:sz w:val="17"/>
+              </w:rPr>
+              <w:t>Feature</w:t>
+            </w:r>
+          </w:p>
+        </w:tc>
+        <w:tc>
+          <w:tcPr>
+            <w:tcW w:type="dxa" w:w="3969"/>
+            <w:shd w:val="clear" w:color="auto" w:fill="2D6A4F"/>
+          </w:tcPr>
+          <w:p>
+            <w:pPr>
+              <w:jc w:val="center"/>
+            </w:pPr>
+            <w:r>
+              <w:rPr>
+                <w:rFonts w:ascii="Calibri" w:hAnsi="Calibri"/>
+                <w:b/>
+                <w:color w:val="FFFFFF"/>
+                <w:sz w:val="17"/>
+              </w:rPr>
+              <w:t>Lightning Strike</w:t>
+            </w:r>
+          </w:p>
+        </w:tc>
+        <w:tc>
+          <w:tcPr>
+            <w:tcW w:type="dxa" w:w="3969"/>
+            <w:shd w:val="clear" w:color="auto" w:fill="2D6A4F"/>
+          </w:tcPr>
+          <w:p>
+            <w:pPr>
+              <w:jc w:val="center"/>
+            </w:pPr>
+            <w:r>
+              <w:rPr>
+                <w:rFonts w:ascii="Calibri" w:hAnsi="Calibri"/>
+                <w:b/>
+                <w:color w:val="FFFFFF"/>
+                <w:sz w:val="17"/>
+              </w:rPr>
+              <w:t>Man-Made Electrocution</w:t>
+            </w:r>
+          </w:p>
+        </w:tc>
+      </w:tr>
+      <w:tr>
+        <w:tc>
+          <w:tcPr>
+            <w:tcW w:type="dxa" w:w="1701"/>
+            <w:shd w:val="clear" w:color="auto" w:fill="FFFFFF"/>
+          </w:tcPr>
+          <w:p>
+            <w:r>
+              <w:rPr>
+                <w:rFonts w:ascii="Calibri" w:hAnsi="Calibri"/>
+                <w:b w:val="0"/>
+                <w:color w:val="1A1A1A"/>
+                <w:sz w:val="17"/>
+              </w:rPr>
+              <w:t>Skin marks</w:t>
+            </w:r>
+          </w:p>
+        </w:tc>
+        <w:tc>
+          <w:tcPr>
+            <w:tcW w:type="dxa" w:w="3969"/>
+            <w:shd w:val="clear" w:color="auto" w:fill="FFFFFF"/>
+          </w:tcPr>
+          <w:p>
+            <w:r>
+              <w:rPr>
+                <w:rFonts w:ascii="Calibri" w:hAnsi="Calibri"/>
+                <w:b w:val="0"/>
+                <w:color w:val="1A1A1A"/>
+                <w:sz w:val="17"/>
+              </w:rPr>
+              <w:t>LICHTENBERG FIGURES — arborescent/fern-like pink-red "ferning" (pathognomonic); appear ~1 hr, fade 24–36 hr</w:t>
+            </w:r>
+          </w:p>
+        </w:tc>
+        <w:tc>
+          <w:tcPr>
+            <w:tcW w:type="dxa" w:w="3969"/>
+            <w:shd w:val="clear" w:color="auto" w:fill="FFFFFF"/>
+          </w:tcPr>
+          <w:p>
+            <w:r>
+              <w:rPr>
+                <w:rFonts w:ascii="Calibri" w:hAnsi="Calibri"/>
+                <w:b w:val="0"/>
+                <w:color w:val="1A1A1A"/>
+                <w:sz w:val="17"/>
+              </w:rPr>
+              <w:t>DISCRETE deep contact/current burns at well-defined entry and exit</w:t>
+            </w:r>
+          </w:p>
+        </w:tc>
+      </w:tr>
+      <w:tr>
+        <w:tc>
+          <w:tcPr>
+            <w:tcW w:type="dxa" w:w="1701"/>
+            <w:shd w:val="clear" w:color="auto" w:fill="EAF7EE"/>
+          </w:tcPr>
+          <w:p>
+            <w:r>
+              <w:rPr>
+                <w:rFonts w:ascii="Calibri" w:hAnsi="Calibri"/>
+                <w:b w:val="0"/>
+                <w:color w:val="1A1A1A"/>
+                <w:sz w:val="17"/>
+              </w:rPr>
+              <w:t>Tissue damage</w:t>
+            </w:r>
+          </w:p>
+        </w:tc>
+        <w:tc>
+          <w:tcPr>
+            <w:tcW w:type="dxa" w:w="3969"/>
+            <w:shd w:val="clear" w:color="auto" w:fill="EAF7EE"/>
+          </w:tcPr>
+          <w:p>
+            <w:r>
+              <w:rPr>
+                <w:rFonts w:ascii="Calibri" w:hAnsi="Calibri"/>
+                <w:b w:val="0"/>
+                <w:color w:val="1A1A1A"/>
+                <w:sz w:val="17"/>
+              </w:rPr>
+              <w:t>Superficial/transient — NOT true burns; minimal histology change</w:t>
+            </w:r>
+          </w:p>
+        </w:tc>
+        <w:tc>
+          <w:tcPr>
+            <w:tcW w:type="dxa" w:w="3969"/>
+            <w:shd w:val="clear" w:color="auto" w:fill="EAF7EE"/>
+          </w:tcPr>
+          <w:p>
+            <w:r>
+              <w:rPr>
+                <w:rFonts w:ascii="Calibri" w:hAnsi="Calibri"/>
+                <w:b w:val="0"/>
+                <w:color w:val="1A1A1A"/>
+                <w:sz w:val="17"/>
+              </w:rPr>
+              <w:t>Focal DEEP charring; coagulative necrosis; metallization</w:t>
+            </w:r>
+          </w:p>
+        </w:tc>
+      </w:tr>
+      <w:tr>
+        <w:tc>
+          <w:tcPr>
+            <w:tcW w:type="dxa" w:w="1701"/>
+            <w:shd w:val="clear" w:color="auto" w:fill="FFFFFF"/>
+          </w:tcPr>
+          <w:p>
+            <w:r>
+              <w:rPr>
+                <w:rFonts w:ascii="Calibri" w:hAnsi="Calibri"/>
+                <w:b w:val="0"/>
+                <w:color w:val="1A1A1A"/>
+                <w:sz w:val="17"/>
+              </w:rPr>
+              <w:t>Number of animals</w:t>
+            </w:r>
+          </w:p>
+        </w:tc>
+        <w:tc>
+          <w:tcPr>
+            <w:tcW w:type="dxa" w:w="3969"/>
+            <w:shd w:val="clear" w:color="auto" w:fill="FFFFFF"/>
+          </w:tcPr>
+          <w:p>
+            <w:r>
+              <w:rPr>
+                <w:rFonts w:ascii="Calibri" w:hAnsi="Calibri"/>
+                <w:b w:val="0"/>
+                <w:color w:val="1A1A1A"/>
+                <w:sz w:val="17"/>
+              </w:rPr>
+              <w:t>Often MULTIPLE animals down together</w:t>
+            </w:r>
+          </w:p>
+        </w:tc>
+        <w:tc>
+          <w:tcPr>
+            <w:tcW w:type="dxa" w:w="3969"/>
+            <w:shd w:val="clear" w:color="auto" w:fill="FFFFFF"/>
+          </w:tcPr>
+          <w:p>
+            <w:r>
+              <w:rPr>
+                <w:rFonts w:ascii="Calibri" w:hAnsi="Calibri"/>
+                <w:b w:val="0"/>
+                <w:color w:val="1A1A1A"/>
+                <w:sz w:val="17"/>
+              </w:rPr>
+              <w:t>Usually single animal or a group along a wire line</w:t>
+            </w:r>
+          </w:p>
+        </w:tc>
+      </w:tr>
+      <w:tr>
+        <w:tc>
+          <w:tcPr>
+            <w:tcW w:type="dxa" w:w="1701"/>
+            <w:shd w:val="clear" w:color="auto" w:fill="EAF7EE"/>
+          </w:tcPr>
+          <w:p>
+            <w:r>
+              <w:rPr>
+                <w:rFonts w:ascii="Calibri" w:hAnsi="Calibri"/>
+                <w:b w:val="0"/>
+                <w:color w:val="1A1A1A"/>
+                <w:sz w:val="17"/>
+              </w:rPr>
+              <w:t>Scene</w:t>
+            </w:r>
+          </w:p>
+        </w:tc>
+        <w:tc>
+          <w:tcPr>
+            <w:tcW w:type="dxa" w:w="3969"/>
+            <w:shd w:val="clear" w:color="auto" w:fill="EAF7EE"/>
+          </w:tcPr>
+          <w:p>
+            <w:r>
+              <w:rPr>
+                <w:rFonts w:ascii="Calibri" w:hAnsi="Calibri"/>
+                <w:b w:val="0"/>
+                <w:color w:val="1A1A1A"/>
+                <w:sz w:val="17"/>
+              </w:rPr>
+              <w:t>Open/exposed ground or under tall trees; split tree; storm history; scorched vegetation</w:t>
+            </w:r>
+          </w:p>
+        </w:tc>
+        <w:tc>
+          <w:tcPr>
+            <w:tcW w:type="dxa" w:w="3969"/>
+            <w:shd w:val="clear" w:color="auto" w:fill="EAF7EE"/>
+          </w:tcPr>
+          <w:p>
+            <w:r>
+              <w:rPr>
+                <w:rFonts w:ascii="Calibri" w:hAnsi="Calibri"/>
+                <w:b w:val="0"/>
+                <w:color w:val="1A1A1A"/>
+                <w:sz w:val="17"/>
+              </w:rPr>
+              <w:t>Proximity to power line, hooked wire, or fence</w:t>
+            </w:r>
+          </w:p>
+        </w:tc>
+      </w:tr>
+      <w:tr>
+        <w:tc>
+          <w:tcPr>
+            <w:tcW w:type="dxa" w:w="1701"/>
+            <w:shd w:val="clear" w:color="auto" w:fill="FFFFFF"/>
+          </w:tcPr>
+          <w:p>
+            <w:r>
+              <w:rPr>
+                <w:rFonts w:ascii="Calibri" w:hAnsi="Calibri"/>
+                <w:b w:val="0"/>
+                <w:color w:val="1A1A1A"/>
+                <w:sz w:val="17"/>
+              </w:rPr>
+              <w:t>Entry/exit</w:t>
+            </w:r>
+          </w:p>
+        </w:tc>
+        <w:tc>
+          <w:tcPr>
+            <w:tcW w:type="dxa" w:w="3969"/>
+            <w:shd w:val="clear" w:color="auto" w:fill="FFFFFF"/>
+          </w:tcPr>
+          <w:p>
+            <w:r>
+              <w:rPr>
+                <w:rFonts w:ascii="Calibri" w:hAnsi="Calibri"/>
+                <w:b w:val="0"/>
+                <w:color w:val="1A1A1A"/>
+                <w:sz w:val="17"/>
+              </w:rPr>
+              <w:t>Poorly defined</w:t>
+            </w:r>
+          </w:p>
+        </w:tc>
+        <w:tc>
+          <w:tcPr>
+            <w:tcW w:type="dxa" w:w="3969"/>
+            <w:shd w:val="clear" w:color="auto" w:fill="FFFFFF"/>
+          </w:tcPr>
+          <w:p>
+            <w:r>
+              <w:rPr>
+                <w:rFonts w:ascii="Calibri" w:hAnsi="Calibri"/>
+                <w:b w:val="0"/>
+                <w:color w:val="1A1A1A"/>
+                <w:sz w:val="17"/>
+              </w:rPr>
+              <w:t>Well-defined (feet often = exit to ground)</w:t>
+            </w:r>
+          </w:p>
+        </w:tc>
+      </w:tr>
+    </w:tbl>
+    <w:p>
+      <w:pPr>
+        <w:spacing w:after="40"/>
+      </w:pPr>
+    </w:p>
+    <w:p>
+      <w:pPr>
+        <w:spacing w:after="40"/>
+        <w:ind w:left="283" w:hanging="170"/>
+      </w:pPr>
+      <w:r>
+        <w:rPr>
+          <w:rFonts w:ascii="Calibri" w:hAnsi="Calibri"/>
+          <w:color w:val="1A1A1A"/>
+          <w:sz w:val="19"/>
+        </w:rPr>
+        <w:t>•  NOTE: Lichtenberg figures are NOT burns — histology shows only subtle superficial dermal capillary dilatation, no deep damage; "magnetisation of nearby metal" is a low-confidence discriminator</w:t>
+      </w:r>
+    </w:p>
+    <w:tbl>
+      <w:tblPr>
+        <w:tblStyle w:val="TableGrid"/>
+        <w:tblW w:type="auto" w:w="0"/>
+        <w:tblLook w:firstColumn="1" w:firstRow="1" w:lastColumn="0" w:lastRow="0" w:noHBand="0" w:noVBand="1" w:val="04A0"/>
+      </w:tblPr>
+      <w:tblGrid>
+        <w:gridCol w:w="9638"/>
+      </w:tblGrid>
+      <w:tr>
+        <w:tc>
+          <w:tcPr>
+            <w:tcW w:type="dxa" w:w="9638"/>
+            <w:shd w:val="clear" w:color="auto" w:fill="2D6A4F"/>
+          </w:tcPr>
+          <w:p>
+            <w:pPr>
+              <w:spacing w:before="80" w:after="80"/>
+            </w:pPr>
+            <w:r>
+              <w:rPr>
+                <w:rFonts w:ascii="Calibri" w:hAnsi="Calibri"/>
+                <w:b/>
+                <w:color w:val="FFFFFF"/>
+                <w:sz w:val="21"/>
+              </w:rPr>
+              <w:t>6.6  Legal Framework</w:t>
+            </w:r>
+          </w:p>
+        </w:tc>
+      </w:tr>
+    </w:tbl>
+    <w:p>
+      <w:pPr>
+        <w:spacing w:after="40"/>
+      </w:pPr>
+    </w:p>
+    <w:p>
+      <w:pPr>
+        <w:spacing w:after="40"/>
+        <w:ind w:left="283" w:hanging="170"/>
+      </w:pPr>
+      <w:r>
+        <w:rPr>
+          <w:rFonts w:ascii="Calibri" w:hAnsi="Calibri"/>
+          <w:color w:val="1A1A1A"/>
+          <w:sz w:val="19"/>
+        </w:rPr>
+        <w:t>•  WILDLIFE (PROTECTION) ACT 1972: elephant is Schedule I (highest protection); killing prosecuted under Section 51; often filed with IPC 429 and the Electricity Act</w:t>
+      </w:r>
+    </w:p>
+    <w:p>
+      <w:pPr>
+        <w:spacing w:after="40"/>
+        <w:ind w:left="283" w:hanging="170"/>
+      </w:pPr>
+      <w:r>
+        <w:rPr>
+          <w:rFonts w:ascii="Calibri" w:hAnsi="Calibri"/>
+          <w:color w:val="1A1A1A"/>
+          <w:sz w:val="19"/>
+        </w:rPr>
+        <w:t>•  ELECTRICITY ACT 2003: Section 161 (mandatory accident reporting &amp; inquiry within ~24 hr); Section 135 (theft of electricity — illegal hooking); Section 146 (penalty for non-compliance)</w:t>
+      </w:r>
+    </w:p>
+    <w:p>
+      <w:pPr>
+        <w:spacing w:after="40"/>
+        <w:ind w:left="283" w:hanging="170"/>
+      </w:pPr>
+      <w:r>
+        <w:rPr>
+          <w:rFonts w:ascii="Calibri" w:hAnsi="Calibri"/>
+          <w:color w:val="1A1A1A"/>
+          <w:sz w:val="19"/>
+        </w:rPr>
+        <w:t>•  STRICT LIABILITY: NGT has held electricity utilities liable for elephant electrocution from their lines (e.g., CESU Odisha ordered to deposit ₹4 crore + maintain lines against sagging)</w:t>
+      </w:r>
+    </w:p>
+    <w:p>
+      <w:pPr>
+        <w:spacing w:after="40"/>
+        <w:ind w:left="283" w:hanging="170"/>
+      </w:pPr>
+      <w:r>
+        <w:rPr>
+          <w:rFonts w:ascii="Calibri" w:hAnsi="Calibri"/>
+          <w:color w:val="1A1A1A"/>
+          <w:sz w:val="19"/>
+        </w:rPr>
+        <w:t>•  GROUND CLEARANCE: MoEFCC 2010 committee recommended minimum 5.5 m clearance for ≤11 kV lines in vulnerable areas; Karnataka Elephant Task Force: 6.096 m (flat) / 9.144 m (sloping) terrain</w:t>
+      </w:r>
+    </w:p>
+    <w:p>
+      <w:pPr>
+        <w:spacing w:after="40"/>
+        <w:ind w:left="283" w:hanging="170"/>
+      </w:pPr>
+      <w:r>
+        <w:rPr>
+          <w:rFonts w:ascii="Calibri" w:hAnsi="Calibri"/>
+          <w:color w:val="1A1A1A"/>
+          <w:sz w:val="19"/>
+        </w:rPr>
+        <w:t>•  KARNATAKA HIGH COURT (26 Apr 2025, suo motu after elephant "Ashwathamma"): directed underground cabling in eco-sensitive zones; ban/replace illegal fences; AI/CCTV e-surveillance (Nagarahole pilot → statewide); enforce WPA &amp; Electricity Act</w:t>
       </w:r>
     </w:p>
     <w:tbl>
@@ -4284,17 +6278,19 @@
               </w:rPr>
               <w:t>ELECTROCUTION INVESTIGATION CHECKLIST:</w:t>
               <w:br/>
-              <w:t>• Document the SCENE: photograph wires, poles, distance from carcass, sagging height</w:t>
+              <w:t>• Document the SCENE: photograph wires, poles, distance from carcass, sag height (measure!)</w:t>
               <w:br/>
-              <w:t>• Locate and photograph ENTRY/EXIT burn marks with scale bar</w:t>
+              <w:t>• Locate and photograph ENTRY/EXIT current marks with scale bar; sample skin from burn margin</w:t>
               <w:br/>
-              <w:t>• Collect skin from burn margin (histology: coagulative necrosis, "streaming" of epidermal nuclei)</w:t>
+              <w:t>• Histology: coagulative necrosis + nuclear streaming; look for metallization at contact point</w:t>
               <w:br/>
-              <w:t>• Sample heart, lung (congestion/haemorrhage documentation)</w:t>
+              <w:t>• Sample heart, lung (congestion/haemorrhage); document myocardial petechiae</w:t>
               <w:br/>
-              <w:t>• Coordinate with electricity board / police — electrocution is a punishable offence under WPA 1972 &amp; Electricity Act</w:t>
+              <w:t>• RULE OUT lightning: search for Lichtenberg figures, multiple carcasses, storm evidence</w:t>
               <w:br/>
-              <w:t>• Distinguish lightning strike (singeing in arborescent/fern-like pattern, multiple animals) from man-made electrocution</w:t>
+              <w:t>• Coordinate with electricity board / police — electrocution is punishable under WPA 1972 (Sec 51) + Electricity Act (Sec 135/161)</w:t>
+              <w:br/>
+              <w:t>• PREVENTION: convert illegal AC fences to legal pulsed SOLAR energisers (non-lethal short shock)</w:t>
             </w:r>
           </w:p>
         </w:tc>
@@ -4539,7 +6535,7 @@
                 <w:color w:val="FFFFFF"/>
                 <w:sz w:val="21"/>
               </w:rPr>
-              <w:t>7.2  Causes &amp; Pathophysiology</w:t>
+              <w:t>7.2  CEH–Pyometra Complex &amp; Pathophysiology</w:t>
             </w:r>
           </w:p>
         </w:tc>
@@ -4561,7 +6557,7 @@
           <w:color w:val="1A1A1A"/>
           <w:sz w:val="19"/>
         </w:rPr>
-        <w:t>•  HORMONAL CHANGES: Fluctuating progesterone levels and an abnormally thickened uterine lining (endometrium) create an environment favourable for bacterial growth</w:t>
+        <w:t>•  CYSTIC ENDOMETRIAL HYPERPLASIA (CEH) is the principal precursor lesion — present in ~67% of captive Asian elephants (vs 15% African) aged 26–57 yrs (Agnew, Munson &amp; Ramsay, Vet Pathol 2004)</w:t>
       </w:r>
     </w:p>
     <w:p>
@@ -4575,7 +6571,7 @@
           <w:color w:val="1A1A1A"/>
           <w:sz w:val="19"/>
         </w:rPr>
-        <w:t>•  BACTERIAL INFECTION: Bacteria such as Escherichia coli or Enterococcus faecium cause suppurative (pus-forming) inflammation</w:t>
+        <w:t>•  CEH-pyometra complex (canine model): chronic progesterone (luteal) dominance → endometrial gland proliferation + cystic dilation → reduced uterine defence → fluid accumulation → bacterial colonisation → pyometra</w:t>
       </w:r>
     </w:p>
     <w:p>
@@ -4589,7 +6585,7 @@
           <w:color w:val="1A1A1A"/>
           <w:sz w:val="19"/>
         </w:rPr>
-        <w:t>•  PRE-EXISTING CONDITIONS: Cystic Endometrial Hyperplasia (CEH) or benign tumours (leiomyomas/fibroids) frequently complicate the reproductive tract of older captive elephants and trigger pyometra</w:t>
+        <w:t>•  HORMONAL: CEH is "associated with prolonged phases of both estrogen and progesterone influence"; the long luteal phase (~6–12 weeks) maximises endometrial stimulation</w:t>
       </w:r>
     </w:p>
     <w:p>
@@ -4603,7 +6599,21 @@
           <w:color w:val="1A1A1A"/>
           <w:sz w:val="19"/>
         </w:rPr>
-        <w:t>•  The non-breeding (nulliparous) state in captive elephants leads to repeated, uninterrupted oestrous cycles — continuous progesterone exposure predisposes to CEH-pyometra complex (web-elaborated)</w:t>
+        <w:t>•  BACTERIAL: Escherichia coli (predominant), Streptococcus, Staphylococcus, Klebsiella, Proteus, Pseudomonas, Bacteroides — pure or mixed (largely extrapolated; elephant-specific culture series are sparse)</w:t>
+      </w:r>
+    </w:p>
+    <w:p>
+      <w:pPr>
+        <w:spacing w:after="40"/>
+        <w:ind w:left="283" w:hanging="170"/>
+      </w:pPr>
+      <w:r>
+        <w:rPr>
+          <w:rFonts w:ascii="Calibri" w:hAnsi="Calibri"/>
+          <w:color w:val="1A1A1A"/>
+          <w:sz w:val="19"/>
+        </w:rPr>
+        <w:t>•  CO-PATHOLOGY: Uterine LEIOMYOMAS are the most common reproductive tumour — more prevalent/larger in older nulliparous Asian elephants (reported 30–100%; one series 90% of neoplasia cases); ~13% uterine adenocarcinoma</w:t>
       </w:r>
     </w:p>
     <w:tbl>
@@ -4632,7 +6642,179 @@
                 <w:color w:val="FFFFFF"/>
                 <w:sz w:val="21"/>
               </w:rPr>
-              <w:t>7.3  Treatment</w:t>
+              <w:t>7.3  Why Nulliparous Captive Females Are Predisposed</w:t>
+            </w:r>
+          </w:p>
+        </w:tc>
+      </w:tr>
+    </w:tbl>
+    <w:p>
+      <w:pPr>
+        <w:spacing w:after="40"/>
+      </w:pPr>
+    </w:p>
+    <w:p>
+      <w:pPr>
+        <w:spacing w:after="40"/>
+        <w:ind w:left="283" w:hanging="170"/>
+      </w:pPr>
+      <w:r>
+        <w:rPr>
+          <w:rFonts w:ascii="Calibri" w:hAnsi="Calibri"/>
+          <w:color w:val="1A1A1A"/>
+          <w:sz w:val="19"/>
+        </w:rPr>
+        <w:t>•  ASYMMETRIC REPRODUCTIVE AGING (Hermes, Hildebrandt &amp; Göritz 2004): prolonged non-reproductive periods + continuous endogenous steroid exposure → genital pathology, reduced fertility, eventual irreversible acyclicity (males not similarly affected)</w:t>
+      </w:r>
+    </w:p>
+    <w:p>
+      <w:pPr>
+        <w:spacing w:after="40"/>
+        <w:ind w:left="283" w:hanging="170"/>
+      </w:pPr>
+      <w:r>
+        <w:rPr>
+          <w:rFonts w:ascii="Calibri" w:hAnsi="Calibri"/>
+          <w:color w:val="1A1A1A"/>
+          <w:sz w:val="19"/>
+        </w:rPr>
+        <w:t>•  Repeated unbroken oestrous cycling (no pregnancy/lactation "rest") → cumulative unopposed progesterone/estrogen on the endometrium → CEH substrate</w:t>
+      </w:r>
+    </w:p>
+    <w:p>
+      <w:pPr>
+        <w:spacing w:after="40"/>
+        <w:ind w:left="283" w:hanging="170"/>
+      </w:pPr>
+      <w:r>
+        <w:rPr>
+          <w:rFonts w:ascii="Calibri" w:hAnsi="Calibri"/>
+          <w:color w:val="1A1A1A"/>
+          <w:sz w:val="19"/>
+        </w:rPr>
+        <w:t>•  Up to 14% of captive Asian (29% African) elephants are acyclic or cycle irregularly — a marker of this reproductive-health decline</w:t>
+      </w:r>
+    </w:p>
+    <w:tbl>
+      <w:tblPr>
+        <w:tblStyle w:val="TableGrid"/>
+        <w:tblW w:type="auto" w:w="0"/>
+        <w:tblLook w:firstColumn="1" w:firstRow="1" w:lastColumn="0" w:lastRow="0" w:noHBand="0" w:noVBand="1" w:val="04A0"/>
+      </w:tblPr>
+      <w:tblGrid>
+        <w:gridCol w:w="9638"/>
+      </w:tblGrid>
+      <w:tr>
+        <w:tc>
+          <w:tcPr>
+            <w:tcW w:type="dxa" w:w="9638"/>
+            <w:shd w:val="clear" w:color="auto" w:fill="2D6A4F"/>
+          </w:tcPr>
+          <w:p>
+            <w:pPr>
+              <w:spacing w:before="80" w:after="80"/>
+            </w:pPr>
+            <w:r>
+              <w:rPr>
+                <w:rFonts w:ascii="Calibri" w:hAnsi="Calibri"/>
+                <w:b/>
+                <w:color w:val="FFFFFF"/>
+                <w:sz w:val="21"/>
+              </w:rPr>
+              <w:t>7.4  Reproductive-Tract Anatomy — Why Drainage Is Hard</w:t>
+            </w:r>
+          </w:p>
+        </w:tc>
+      </w:tr>
+    </w:tbl>
+    <w:p>
+      <w:pPr>
+        <w:spacing w:after="40"/>
+      </w:pPr>
+    </w:p>
+    <w:p>
+      <w:pPr>
+        <w:spacing w:after="40"/>
+        <w:ind w:left="283" w:hanging="170"/>
+      </w:pPr>
+      <w:r>
+        <w:rPr>
+          <w:rFonts w:ascii="Calibri" w:hAnsi="Calibri"/>
+          <w:color w:val="1A1A1A"/>
+          <w:sz w:val="19"/>
+        </w:rPr>
+        <w:t>•  The elephant has an EXCEPTIONALLY LONG vestibule (urogenital canal), ~1.0–1.4 m, opening between the hind legs</w:t>
+      </w:r>
+    </w:p>
+    <w:p>
+      <w:pPr>
+        <w:spacing w:after="40"/>
+        <w:ind w:left="283" w:hanging="170"/>
+      </w:pPr>
+      <w:r>
+        <w:rPr>
+          <w:rFonts w:ascii="Calibri" w:hAnsi="Calibri"/>
+          <w:color w:val="1A1A1A"/>
+          <w:sz w:val="19"/>
+        </w:rPr>
+        <w:t>•  A membranous HYMENAL constriction (orifice &lt;2 cm) separates urogenital canal from vagina in nulliparous animals</w:t>
+      </w:r>
+    </w:p>
+    <w:p>
+      <w:pPr>
+        <w:spacing w:after="40"/>
+        <w:ind w:left="283" w:hanging="170"/>
+      </w:pPr>
+      <w:r>
+        <w:rPr>
+          <w:rFonts w:ascii="Calibri" w:hAnsi="Calibri"/>
+          <w:color w:val="1A1A1A"/>
+          <w:sz w:val="19"/>
+        </w:rPr>
+        <w:t>•  Total tract length (vulva-to-ovary) ranges 120–358 cm — this long, narrow, valved canal IMPEDES natural drainage and makes transcervical access very difficult, favouring closed-type pus accumulation</w:t>
+      </w:r>
+    </w:p>
+    <w:p>
+      <w:pPr>
+        <w:spacing w:after="40"/>
+        <w:ind w:left="283" w:hanging="170"/>
+      </w:pPr>
+      <w:r>
+        <w:rPr>
+          <w:rFonts w:ascii="Calibri" w:hAnsi="Calibri"/>
+          <w:color w:val="1A1A1A"/>
+          <w:sz w:val="19"/>
+        </w:rPr>
+        <w:t>•  ULTRASONOGRAPHY is the key diagnostic tool for endometrial cysts, CEH, leiomyoma, and intrauterine fluid/pyometra</w:t>
+      </w:r>
+    </w:p>
+    <w:tbl>
+      <w:tblPr>
+        <w:tblStyle w:val="TableGrid"/>
+        <w:tblW w:type="auto" w:w="0"/>
+        <w:tblLook w:firstColumn="1" w:firstRow="1" w:lastColumn="0" w:lastRow="0" w:noHBand="0" w:noVBand="1" w:val="04A0"/>
+      </w:tblPr>
+      <w:tblGrid>
+        <w:gridCol w:w="9638"/>
+      </w:tblGrid>
+      <w:tr>
+        <w:tc>
+          <w:tcPr>
+            <w:tcW w:type="dxa" w:w="9638"/>
+            <w:shd w:val="clear" w:color="auto" w:fill="2D6A4F"/>
+          </w:tcPr>
+          <w:p>
+            <w:pPr>
+              <w:spacing w:before="80" w:after="80"/>
+            </w:pPr>
+            <w:r>
+              <w:rPr>
+                <w:rFonts w:ascii="Calibri" w:hAnsi="Calibri"/>
+                <w:b/>
+                <w:color w:val="FFFFFF"/>
+                <w:sz w:val="21"/>
+              </w:rPr>
+              <w:t>7.5  Treatment</w:t>
             </w:r>
           </w:p>
         </w:tc>
@@ -4726,7 +6908,7 @@
                 <w:color w:val="1A1A1A"/>
                 <w:sz w:val="17"/>
               </w:rPr>
-              <w:t>Use of GnRH vaccines (like Improvac) or Deslorelin implants to suppress reproductive cycles and shrink the affected uterine tissue</w:t>
+              <w:t>GnRH vaccine (Improvac-type) → anti-GnRH antibodies block GnRH → ↓LH/FSH → suppress cyclicity &amp; remove progesterone drive. Also Deslorelin (GnRH agonist) implants → pituitary down-regulation. EAZA: treat pyometra BEFORE GnRH vaccination</w:t>
             </w:r>
           </w:p>
         </w:tc>
@@ -4762,7 +6944,7 @@
                 <w:color w:val="1A1A1A"/>
                 <w:sz w:val="17"/>
               </w:rPr>
-              <w:t>Broad-spectrum systemic antibiotics targeting the specific cultured pathogens</w:t>
+              <w:t>Broad-spectrum systemic antibiotics, ideally culture-guided</w:t>
             </w:r>
           </w:p>
         </w:tc>
@@ -4781,7 +6963,7 @@
                 <w:color w:val="1A1A1A"/>
                 <w:sz w:val="17"/>
               </w:rPr>
-              <w:t>iii. Uterine Lavage</w:t>
+              <w:t>iii. Uterine / Transcervical Lavage</w:t>
             </w:r>
           </w:p>
         </w:tc>
@@ -4798,7 +6980,7 @@
                 <w:color w:val="1A1A1A"/>
                 <w:sz w:val="17"/>
               </w:rPr>
-              <w:t>Flushing the uterus to evacuate accumulated pus</w:t>
+              <w:t>Flushing the uterus with warm sterile saline to evacuate pus — constrained by the long urogenital canal/hymen</w:t>
             </w:r>
           </w:p>
         </w:tc>
@@ -4817,7 +6999,7 @@
                 <w:color w:val="1A1A1A"/>
                 <w:sz w:val="17"/>
               </w:rPr>
-              <w:t>iv. Surgical Drainage</w:t>
+              <w:t>iv. Prostaglandins (PGF2α)</w:t>
             </w:r>
           </w:p>
         </w:tc>
@@ -4834,7 +7016,7 @@
                 <w:color w:val="1A1A1A"/>
                 <w:sz w:val="17"/>
               </w:rPr>
-              <w:t>Vaginal vestibulotomy — surgical opening to drain the uterine pus (as shown in slide 10)</w:t>
+              <w:t>Promote myometrial contraction &amp; cervical relaxation to expel contents (minimally documented in elephants)</w:t>
             </w:r>
           </w:p>
         </w:tc>
@@ -4853,7 +7035,7 @@
                 <w:color w:val="1A1A1A"/>
                 <w:sz w:val="17"/>
               </w:rPr>
-              <w:t>v. Homeopathic (practised)</w:t>
+              <w:t>v. Surgical Drainage</w:t>
             </w:r>
           </w:p>
         </w:tc>
@@ -4870,7 +7052,43 @@
                 <w:color w:val="1A1A1A"/>
                 <w:sz w:val="17"/>
               </w:rPr>
-              <w:t>Pyrogenium 1000 + Hepar sulph 1000 + Secale 1000 (as documented by Dr. Shrivastava)</w:t>
+              <w:t>Vaginal vestibulotomy — surgical access through the long urogenital canal for lavage/drainage (slide 10)</w:t>
+            </w:r>
+          </w:p>
+        </w:tc>
+      </w:tr>
+      <w:tr>
+        <w:tc>
+          <w:tcPr>
+            <w:tcW w:type="dxa" w:w="2551"/>
+            <w:shd w:val="clear" w:color="auto" w:fill="EAF7EE"/>
+          </w:tcPr>
+          <w:p>
+            <w:r>
+              <w:rPr>
+                <w:rFonts w:ascii="Calibri" w:hAnsi="Calibri"/>
+                <w:b w:val="0"/>
+                <w:color w:val="1A1A1A"/>
+                <w:sz w:val="17"/>
+              </w:rPr>
+              <w:t>vi. Homeopathic (practised)</w:t>
+            </w:r>
+          </w:p>
+        </w:tc>
+        <w:tc>
+          <w:tcPr>
+            <w:tcW w:type="dxa" w:w="7087"/>
+            <w:shd w:val="clear" w:color="auto" w:fill="EAF7EE"/>
+          </w:tcPr>
+          <w:p>
+            <w:r>
+              <w:rPr>
+                <w:rFonts w:ascii="Calibri" w:hAnsi="Calibri"/>
+                <w:b w:val="0"/>
+                <w:color w:val="1A1A1A"/>
+                <w:sz w:val="17"/>
+              </w:rPr>
+              <w:t>Pyrogenium 1000 + Hepar sulph 1000 + Secale 1000 (documented by Dr. Shrivastava)</w:t>
             </w:r>
           </w:p>
         </w:tc>
@@ -4880,6 +7098,99 @@
       <w:pPr>
         <w:spacing w:after="40"/>
       </w:pPr>
+    </w:p>
+    <w:p>
+      <w:pPr>
+        <w:spacing w:after="40"/>
+        <w:ind w:left="283" w:hanging="170"/>
+      </w:pPr>
+      <w:r>
+        <w:rPr>
+          <w:rFonts w:ascii="Calibri" w:hAnsi="Calibri"/>
+          <w:color w:val="1A1A1A"/>
+          <w:sz w:val="19"/>
+        </w:rPr>
+        <w:t>•  OVARIOHYSTERECTOMY is NOT practical in adult elephants — body size, vascularity, and extreme tract length (up to 358 cm) make it unfeasible; management is conservative/palliative</w:t>
+      </w:r>
+    </w:p>
+    <w:p>
+      <w:pPr>
+        <w:spacing w:after="40"/>
+        <w:ind w:left="283" w:hanging="170"/>
+      </w:pPr>
+      <w:r>
+        <w:rPr>
+          <w:rFonts w:ascii="Calibri" w:hAnsi="Calibri"/>
+          <w:color w:val="1A1A1A"/>
+          <w:sz w:val="19"/>
+        </w:rPr>
+        <w:t>•  PROGNOSIS: guarded to poor. Documented cases (deslorelin + antibiotics) showed short-term improvement but the animals later died (necropsy: enlarged uterus, leiomyoma). Advanced closed-cervix pyometra → uterine distension, rupture, peritonitis, sepsis, death</w:t>
+      </w:r>
+    </w:p>
+    <w:tbl>
+      <w:tblPr>
+        <w:tblStyle w:val="TableGrid"/>
+        <w:tblW w:type="auto" w:w="0"/>
+        <w:tblLook w:firstColumn="1" w:firstRow="1" w:lastColumn="0" w:lastRow="0" w:noHBand="0" w:noVBand="1" w:val="04A0"/>
+      </w:tblPr>
+      <w:tblGrid>
+        <w:gridCol w:w="9638"/>
+      </w:tblGrid>
+      <w:tr>
+        <w:tc>
+          <w:tcPr>
+            <w:tcW w:type="dxa" w:w="9638"/>
+            <w:shd w:val="clear" w:color="auto" w:fill="2D6A4F"/>
+          </w:tcPr>
+          <w:p>
+            <w:pPr>
+              <w:spacing w:before="80" w:after="80"/>
+            </w:pPr>
+            <w:r>
+              <w:rPr>
+                <w:rFonts w:ascii="Calibri" w:hAnsi="Calibri"/>
+                <w:b/>
+                <w:color w:val="FFFFFF"/>
+                <w:sz w:val="21"/>
+              </w:rPr>
+              <w:t>7.6  Luteal-Phase Caution &amp; Prevention</w:t>
+            </w:r>
+          </w:p>
+        </w:tc>
+      </w:tr>
+    </w:tbl>
+    <w:p>
+      <w:pPr>
+        <w:spacing w:after="40"/>
+      </w:pPr>
+    </w:p>
+    <w:p>
+      <w:pPr>
+        <w:spacing w:after="40"/>
+        <w:ind w:left="283" w:hanging="170"/>
+      </w:pPr>
+      <w:r>
+        <w:rPr>
+          <w:rFonts w:ascii="Calibri" w:hAnsi="Calibri"/>
+          <w:color w:val="1A1A1A"/>
+          <w:sz w:val="19"/>
+        </w:rPr>
+        <w:t>•  Elephant cycle: luteal (high-progesterone) phase ~6–12 weeks, follicular ~4–6 weeks; extended low-progesterone (&gt;12 weeks) = acyclicity/"flatlining"</w:t>
+      </w:r>
+    </w:p>
+    <w:p>
+      <w:pPr>
+        <w:spacing w:after="40"/>
+        <w:ind w:left="283" w:hanging="170"/>
+      </w:pPr>
+      <w:r>
+        <w:rPr>
+          <w:rFonts w:ascii="Calibri" w:hAnsi="Calibri"/>
+          <w:color w:val="1A1A1A"/>
+          <w:sz w:val="19"/>
+        </w:rPr>
+        <w:t>•  Avoid GnRH-agonist implantation during the luteal (diestrus) phase — high progesterone increases pyometra risk</w:t>
+      </w:r>
     </w:p>
     <w:tbl>
       <w:tblPr>
@@ -4907,7 +7218,7 @@
                 <w:color w:val="1B4332"/>
                 <w:sz w:val="18"/>
               </w:rPr>
-              <w:t>CLINICAL NOTE: Pyometra is a reproductive EMERGENCY in elephants. Toxins from the infected uterus (endotoxaemia) can cause septic shock and death. In captive females, prevention centres on managed breeding or hormonal cycle suppression to break the cystic-endometrial-hyperplasia → pyometra cascade. Vaginal vestibulotomy provides surgical drainage when medical management fails.</w:t>
+              <w:t>CLINICAL NOTE: Pyometra is a reproductive EMERGENCY in elephants. Toxins from the infected uterus (endotoxaemia) can cause septic shock and death. The long valved urogenital canal favours CLOSED-type pus accumulation and impairs drainage — raising mortality. In captive females, prevention centres on managed breeding or hormonal cycle suppression to break the CEH → pyometra cascade. Vaginal vestibulotomy provides surgical drainage when medical management fails; ovariohysterectomy is not feasible.</w:t>
             </w:r>
           </w:p>
         </w:tc>
@@ -5016,6 +7327,22 @@
         <w:t>Hyperthermia is a life-threatening condition caused by high environmental temperature, a lack of access to water or shade, massive body size, and lack of sweat glands. It is a serious welfare and mortality concern for both working/captive and free-ranging elephants during Indian summers.</w:t>
       </w:r>
     </w:p>
+    <w:p>
+      <w:pPr>
+        <w:spacing w:after="80"/>
+        <w:jc w:val="both"/>
+      </w:pPr>
+      <w:r>
+        <w:rPr>
+          <w:rFonts w:ascii="Calibri" w:hAnsi="Calibri"/>
+          <w:b w:val="0"/>
+          <w:i w:val="0"/>
+          <w:color w:val="1A1A1A"/>
+          <w:sz w:val="19"/>
+        </w:rPr>
+        <w:t>Normal elephant core body temperature is comparatively LOW (~36.2 ± 0.5°C; working range ≈ 35.9–37°C) and they do NOT pant or sweat conventionally — making heat dissipation, not heat generation, the physiological challenge.</w:t>
+      </w:r>
+    </w:p>
     <w:tbl>
       <w:tblPr>
         <w:tblStyle w:val="TableGrid"/>
@@ -5064,7 +7391,7 @@
           <w:color w:val="1A1A1A"/>
           <w:sz w:val="19"/>
         </w:rPr>
-        <w:t>•  THE SQUARE-CUBE LAW: As body volume increases, heat production rises faster than the skin surface area available to dissipate it. Massive body size is good for RETAINING heat but POOR at losing it</w:t>
+        <w:t>•  THE SQUARE-CUBE LAW: surface area scales as the square while volume/mass scales as the cube — so giants have proportionally little skin to dump metabolic heat. Heat dissipation problems set in above ~35°C ambient</w:t>
       </w:r>
     </w:p>
     <w:p>
@@ -5078,7 +7405,7 @@
           <w:color w:val="1A1A1A"/>
           <w:sz w:val="19"/>
         </w:rPr>
-        <w:t>•  LACK OF SWEAT GLANDS: Elephants do not have traditional (distributed) sweat glands. They have pores only between their toes and rely on "transepidermal water loss" (passive moisture diffusion through skin)</w:t>
+        <w:t>•  COMPENSATION: elephants' thermal conductance is 3–5× higher than predicted allometrically, attributed to their lack of fur (offsets the low surface-area:volume disadvantage)</w:t>
       </w:r>
     </w:p>
     <w:p>
@@ -5092,7 +7419,114 @@
           <w:color w:val="1A1A1A"/>
           <w:sz w:val="19"/>
         </w:rPr>
-        <w:t>•  METABOLIC HEAT: Continuous physical activity (walking in hot sunlight without rest or water) generates high metabolic heat that easily triggers hyperthermia if the animal cannot cool down</w:t>
+        <w:t>•  HEAT STORAGE: during exercise in full sun (8–34.5°C ambient), 56–100% of active metabolic heat is STORED in core tissues and dumped later (often at night) — elephants "ride out" heat</w:t>
+      </w:r>
+    </w:p>
+    <w:p>
+      <w:pPr>
+        <w:spacing w:after="40"/>
+        <w:ind w:left="283" w:hanging="170"/>
+      </w:pPr>
+      <w:r>
+        <w:rPr>
+          <w:rFonts w:ascii="Calibri" w:hAnsi="Calibri"/>
+          <w:color w:val="1A1A1A"/>
+          <w:sz w:val="19"/>
+        </w:rPr>
+        <w:t>•  METABOLIC HEAT: continuous walking in hot sun without rest/water generates heat faster than it can be lost; modelling suggests arterial blood can rise ~5°C to potentially lethal levels after ~15 min locomotion at 26°C ambient</w:t>
+      </w:r>
+    </w:p>
+    <w:tbl>
+      <w:tblPr>
+        <w:tblStyle w:val="TableGrid"/>
+        <w:tblW w:type="auto" w:w="0"/>
+        <w:tblLook w:firstColumn="1" w:firstRow="1" w:lastColumn="0" w:lastRow="0" w:noHBand="0" w:noVBand="1" w:val="04A0"/>
+      </w:tblPr>
+      <w:tblGrid>
+        <w:gridCol w:w="9638"/>
+      </w:tblGrid>
+      <w:tr>
+        <w:tc>
+          <w:tcPr>
+            <w:tcW w:type="dxa" w:w="9638"/>
+            <w:shd w:val="clear" w:color="auto" w:fill="2D6A4F"/>
+          </w:tcPr>
+          <w:p>
+            <w:pPr>
+              <w:spacing w:before="80" w:after="80"/>
+            </w:pPr>
+            <w:r>
+              <w:rPr>
+                <w:rFonts w:ascii="Calibri" w:hAnsi="Calibri"/>
+                <w:b/>
+                <w:color w:val="FFFFFF"/>
+                <w:sz w:val="21"/>
+              </w:rPr>
+              <w:t>8.2b  The Sweat-Gland Question — Precise Science</w:t>
+            </w:r>
+          </w:p>
+        </w:tc>
+      </w:tr>
+    </w:tbl>
+    <w:p>
+      <w:pPr>
+        <w:spacing w:after="40"/>
+      </w:pPr>
+    </w:p>
+    <w:p>
+      <w:pPr>
+        <w:spacing w:after="40"/>
+        <w:ind w:left="283" w:hanging="170"/>
+      </w:pPr>
+      <w:r>
+        <w:rPr>
+          <w:rFonts w:ascii="Calibri" w:hAnsi="Calibri"/>
+          <w:color w:val="1A1A1A"/>
+          <w:sz w:val="19"/>
+        </w:rPr>
+        <w:t>•  The claim "elephants have no sweat glands" is an OVERSIMPLIFICATION — they lack dense, body-wide conventional sweat glands, but specialised glands and high cutaneous water loss DO exist</w:t>
+      </w:r>
+    </w:p>
+    <w:p>
+      <w:pPr>
+        <w:spacing w:after="40"/>
+        <w:ind w:left="283" w:hanging="170"/>
+      </w:pPr>
+      <w:r>
+        <w:rPr>
+          <w:rFonts w:ascii="Calibri" w:hAnsi="Calibri"/>
+          <w:color w:val="1A1A1A"/>
+          <w:sz w:val="19"/>
+        </w:rPr>
+        <w:t>•  INTERDIGITAL GLANDS resembling human eccrine sweat glands occur between the toes/toenail cuticles of the Asian elephant — true sweat-gland tissue, but restricted to the feet (minimal thermoregulatory role)</w:t>
+      </w:r>
+    </w:p>
+    <w:p>
+      <w:pPr>
+        <w:spacing w:after="40"/>
+        <w:ind w:left="283" w:hanging="170"/>
+      </w:pPr>
+      <w:r>
+        <w:rPr>
+          <w:rFonts w:ascii="Calibri" w:hAnsi="Calibri"/>
+          <w:color w:val="1A1A1A"/>
+          <w:sz w:val="19"/>
+        </w:rPr>
+        <w:t>•  Elephants show very high CUTANEOUS EVAPORATIVE WATER LOSS (CEWL): 0.31–8.9 g·min⁻¹·m⁻² (Asian) — water diffuses through the bare skin itself, not via glands (Dunkin et al. 2013)</w:t>
+      </w:r>
+    </w:p>
+    <w:p>
+      <w:pPr>
+        <w:spacing w:after="40"/>
+        <w:ind w:left="283" w:hanging="170"/>
+      </w:pPr>
+      <w:r>
+        <w:rPr>
+          <w:rFonts w:ascii="Calibri" w:hAnsi="Calibri"/>
+          <w:color w:val="1A1A1A"/>
+          <w:sz w:val="19"/>
+        </w:rPr>
+        <w:t>•  SKIN MICRO-CRACKS: African elephant skin fractures into millions of true micro-channels that retain 5–10× more water/mud than a flat surface, prolonging evaporative cooling (Martins et al. 2018, Nature Comms)</w:t>
       </w:r>
     </w:p>
     <w:tbl>
@@ -5198,7 +7632,7 @@
                 <w:color w:val="1A1A1A"/>
                 <w:sz w:val="17"/>
               </w:rPr>
-              <w:t>The Ears</w:t>
+              <w:t>The Ears (thermal windows)</w:t>
             </w:r>
           </w:p>
         </w:tc>
@@ -5215,7 +7649,7 @@
                 <w:color w:val="1A1A1A"/>
                 <w:sz w:val="17"/>
               </w:rPr>
-              <w:t>Elephant ears act as giant THERMAL WINDOWS. Flapping cools the blood circulating through the dense ear vasculature, reducing overall body temperature significantly</w:t>
+              <w:t>Large, thin, highly vascularised pinnae. Elephants vasodilate/"flood" the ears with blood, then flap to create convective + evaporative cooling; cooled blood returns to core. Up to ~100% of an African elephant's heat-loss need can be met by the pinnae (Phillips &amp; Heath 1992)</w:t>
             </w:r>
           </w:p>
         </w:tc>
@@ -5251,7 +7685,7 @@
                 <w:color w:val="1A1A1A"/>
                 <w:sz w:val="17"/>
               </w:rPr>
-              <w:t>Bathing in mud and water is vital. Water evaporation provides intensive cooling; residual mud protects skin from solar radiation. Elephants also spray their own saliva</w:t>
+              <w:t>Bathing in mud/water + trunk-spraying water = PRIMARY evaporative cooling. Water evaporation cools; residual mud blocks solar radiation and prolongs water retention</w:t>
             </w:r>
           </w:p>
         </w:tc>
@@ -5270,7 +7704,7 @@
                 <w:color w:val="1A1A1A"/>
                 <w:sz w:val="17"/>
               </w:rPr>
-              <w:t>Skin Permeability</w:t>
+              <w:t>Cutaneous Water Loss</w:t>
             </w:r>
           </w:p>
         </w:tc>
@@ -5287,7 +7721,7 @@
                 <w:color w:val="1A1A1A"/>
                 <w:sz w:val="17"/>
               </w:rPr>
-              <w:t>The elephant's hide becomes more PERMEABLE in hot weather, allowing them to lose moisture and cool down faster through evaporation — provided they have access to drinking water</w:t>
+              <w:t>Water diffuses through the bare skin itself; skin micro-channels hold applied water/mud. At 29–32°C ambient, evaporative cooling becomes the ONLY remaining avenue</w:t>
             </w:r>
           </w:p>
         </w:tc>
@@ -5306,7 +7740,7 @@
                 <w:color w:val="1A1A1A"/>
                 <w:sz w:val="17"/>
               </w:rPr>
-              <w:t>Skin Wrinkles</w:t>
+              <w:t>Body-wide thermal windows</w:t>
             </w:r>
           </w:p>
         </w:tc>
@@ -5323,7 +7757,7 @@
                 <w:color w:val="1A1A1A"/>
                 <w:sz w:val="17"/>
               </w:rPr>
-              <w:t>(web-elaborated) Deep skin wrinkles increase surface area and retain water/mud after wallowing, prolonging evaporative cooling</w:t>
+              <w:t>Discrete hot vascular patches appear across the whole body surface (not just ears) as ambient temperature rises (Weissenböck et al. 2010)</w:t>
             </w:r>
           </w:p>
         </w:tc>
@@ -5360,7 +7794,207 @@
                 <w:color w:val="FFFFFF"/>
                 <w:sz w:val="21"/>
               </w:rPr>
-              <w:t>8.4  Prevention &amp; Management (web-elaborated)</w:t>
+              <w:t>8.4  How Heat Stress Kills (Pathophysiology)</w:t>
+            </w:r>
+          </w:p>
+        </w:tc>
+      </w:tr>
+    </w:tbl>
+    <w:p>
+      <w:pPr>
+        <w:spacing w:after="40"/>
+      </w:pPr>
+    </w:p>
+    <w:p>
+      <w:pPr>
+        <w:spacing w:after="40"/>
+        <w:ind w:left="283" w:hanging="170"/>
+      </w:pPr>
+      <w:r>
+        <w:rPr>
+          <w:rFonts w:ascii="Calibri" w:hAnsi="Calibri"/>
+          <w:color w:val="1A1A1A"/>
+          <w:sz w:val="19"/>
+        </w:rPr>
+        <w:t>•  HEAT STROKE = core temperature &gt;40°C plus CNS dysfunction, progressing to multi-organ failure</w:t>
+      </w:r>
+    </w:p>
+    <w:p>
+      <w:pPr>
+        <w:spacing w:after="40"/>
+        <w:ind w:left="283" w:hanging="170"/>
+      </w:pPr>
+      <w:r>
+        <w:rPr>
+          <w:rFonts w:ascii="Calibri" w:hAnsi="Calibri"/>
+          <w:color w:val="1A1A1A"/>
+          <w:sz w:val="19"/>
+        </w:rPr>
+        <w:t>•  Cascade: excess heat → protein denaturation, mitochondrial dysfunction, oxidative stress, release of DAMPs → systemic inflammatory response</w:t>
+      </w:r>
+    </w:p>
+    <w:p>
+      <w:pPr>
+        <w:spacing w:after="40"/>
+        <w:ind w:left="283" w:hanging="170"/>
+      </w:pPr>
+      <w:r>
+        <w:rPr>
+          <w:rFonts w:ascii="Calibri" w:hAnsi="Calibri"/>
+          <w:color w:val="1A1A1A"/>
+          <w:sz w:val="19"/>
+        </w:rPr>
+        <w:t>•  ENDOTHELIAL barrier disruption (unifying lesion) → vascular leak, oedema, microthrombi → impaired perfusion → ischaemic organ injury</w:t>
+      </w:r>
+    </w:p>
+    <w:p>
+      <w:pPr>
+        <w:spacing w:after="40"/>
+        <w:ind w:left="283" w:hanging="170"/>
+      </w:pPr>
+      <w:r>
+        <w:rPr>
+          <w:rFonts w:ascii="Calibri" w:hAnsi="Calibri"/>
+          <w:color w:val="1A1A1A"/>
+          <w:sz w:val="19"/>
+        </w:rPr>
+        <w:t>•  DIC (disseminated intravascular coagulation) reported in ~48% of severe heat-stroke cases — strongly linked to multi-organ dysfunction and death</w:t>
+      </w:r>
+    </w:p>
+    <w:p>
+      <w:pPr>
+        <w:spacing w:after="40"/>
+        <w:ind w:left="283" w:hanging="170"/>
+      </w:pPr>
+      <w:r>
+        <w:rPr>
+          <w:rFonts w:ascii="Calibri" w:hAnsi="Calibri"/>
+          <w:color w:val="1A1A1A"/>
+          <w:sz w:val="19"/>
+        </w:rPr>
+        <w:t>•  Organ-specific: liver (coagulopathy), kidney (rhabdomyolysis → AKI), heart (arrhythmia → circulatory collapse, irreversible shock)</w:t>
+      </w:r>
+    </w:p>
+    <w:tbl>
+      <w:tblPr>
+        <w:tblStyle w:val="TableGrid"/>
+        <w:tblW w:type="auto" w:w="0"/>
+        <w:tblLook w:firstColumn="1" w:firstRow="1" w:lastColumn="0" w:lastRow="0" w:noHBand="0" w:noVBand="1" w:val="04A0"/>
+      </w:tblPr>
+      <w:tblGrid>
+        <w:gridCol w:w="9638"/>
+      </w:tblGrid>
+      <w:tr>
+        <w:tc>
+          <w:tcPr>
+            <w:tcW w:type="dxa" w:w="9638"/>
+            <w:shd w:val="clear" w:color="auto" w:fill="2D6A4F"/>
+          </w:tcPr>
+          <w:p>
+            <w:pPr>
+              <w:spacing w:before="80" w:after="80"/>
+            </w:pPr>
+            <w:r>
+              <w:rPr>
+                <w:rFonts w:ascii="Calibri" w:hAnsi="Calibri"/>
+                <w:b/>
+                <w:color w:val="FFFFFF"/>
+                <w:sz w:val="21"/>
+              </w:rPr>
+              <w:t>8.5  Recent Heat-Wave Deaths in India</w:t>
+            </w:r>
+          </w:p>
+        </w:tc>
+      </w:tr>
+    </w:tbl>
+    <w:p>
+      <w:pPr>
+        <w:spacing w:after="40"/>
+      </w:pPr>
+    </w:p>
+    <w:p>
+      <w:pPr>
+        <w:spacing w:after="40"/>
+        <w:ind w:left="283" w:hanging="170"/>
+      </w:pPr>
+      <w:r>
+        <w:rPr>
+          <w:rFonts w:ascii="Calibri" w:hAnsi="Calibri"/>
+          <w:color w:val="1A1A1A"/>
+          <w:sz w:val="19"/>
+        </w:rPr>
+        <w:t>•  April 2022, Karnataka: two ~15-yr-old elephants died within a week near Cauvery Wildlife Sanctuary — one of heat stroke (Chikkalahalli), one of suspected dehydration (Satnur range), amid drought + extreme heat</w:t>
+      </w:r>
+    </w:p>
+    <w:p>
+      <w:pPr>
+        <w:spacing w:after="40"/>
+        <w:ind w:left="283" w:hanging="170"/>
+      </w:pPr>
+      <w:r>
+        <w:rPr>
+          <w:rFonts w:ascii="Calibri" w:hAnsi="Calibri"/>
+          <w:color w:val="1A1A1A"/>
+          <w:sz w:val="19"/>
+        </w:rPr>
+        <w:t>•  Heat stroke is documented as a cause of death in captive juvenile elephants forced to work in heat without adequate water/shade</w:t>
+      </w:r>
+    </w:p>
+    <w:p>
+      <w:pPr>
+        <w:spacing w:after="40"/>
+        <w:ind w:left="283" w:hanging="170"/>
+      </w:pPr>
+      <w:r>
+        <w:rPr>
+          <w:rFonts w:ascii="Calibri" w:hAnsi="Calibri"/>
+          <w:color w:val="1A1A1A"/>
+          <w:sz w:val="19"/>
+        </w:rPr>
+        <w:t>•  2024 Kerala: record summer heat reported to make captive temple elephants stressed and more aggressive — a heat-attributable welfare crisis</w:t>
+      </w:r>
+    </w:p>
+    <w:p>
+      <w:pPr>
+        <w:spacing w:after="40"/>
+        <w:ind w:left="283" w:hanging="170"/>
+      </w:pPr>
+      <w:r>
+        <w:rPr>
+          <w:rFonts w:ascii="Calibri" w:hAnsi="Calibri"/>
+          <w:color w:val="1A1A1A"/>
+          <w:sz w:val="19"/>
+        </w:rPr>
+        <w:t>•  CAUTION: not all elephant deaths in hot months are heat-related — Odisha's 106 elephant deaths in 2024–25 were largely electrocution, not heat</w:t>
+      </w:r>
+    </w:p>
+    <w:tbl>
+      <w:tblPr>
+        <w:tblStyle w:val="TableGrid"/>
+        <w:tblW w:type="auto" w:w="0"/>
+        <w:tblLook w:firstColumn="1" w:firstRow="1" w:lastColumn="0" w:lastRow="0" w:noHBand="0" w:noVBand="1" w:val="04A0"/>
+      </w:tblPr>
+      <w:tblGrid>
+        <w:gridCol w:w="9638"/>
+      </w:tblGrid>
+      <w:tr>
+        <w:tc>
+          <w:tcPr>
+            <w:tcW w:type="dxa" w:w="9638"/>
+            <w:shd w:val="clear" w:color="auto" w:fill="2D6A4F"/>
+          </w:tcPr>
+          <w:p>
+            <w:pPr>
+              <w:spacing w:before="80" w:after="80"/>
+            </w:pPr>
+            <w:r>
+              <w:rPr>
+                <w:rFonts w:ascii="Calibri" w:hAnsi="Calibri"/>
+                <w:b/>
+                <w:color w:val="FFFFFF"/>
+                <w:sz w:val="21"/>
+              </w:rPr>
+              <w:t>8.6  Prevention &amp; Management</w:t>
             </w:r>
           </w:p>
         </w:tc>
@@ -5424,7 +8058,7 @@
           <w:color w:val="1A1A1A"/>
           <w:sz w:val="19"/>
         </w:rPr>
-        <w:t>•  Recognise heat stress signs: rapid breathing, ear-flapping intensified, lethargy, reluctance to move, collapse</w:t>
+        <w:t>•  Recognise heat-stress signs: rapid breathing, intensified ear-flapping, lethargy, reluctance to move, collapse</w:t>
       </w:r>
     </w:p>
     <w:p>
@@ -5699,7 +8333,7 @@
                 <w:color w:val="FFFFFF"/>
                 <w:sz w:val="21"/>
               </w:rPr>
-              <w:t>9.3  Diagnosis</w:t>
+              <w:t>9.3  Normal Haematology Reference Values (Indian Elephants)</w:t>
             </w:r>
           </w:p>
         </w:tc>
@@ -5712,6 +8346,525 @@
     </w:p>
     <w:p>
       <w:pPr>
+        <w:spacing w:after="60"/>
+        <w:jc w:val="both"/>
+      </w:pPr>
+      <w:r>
+        <w:rPr>
+          <w:rFonts w:ascii="Calibri" w:hAnsi="Calibri"/>
+          <w:b w:val="0"/>
+          <w:i w:val="0"/>
+          <w:color w:val="1A1A1A"/>
+          <w:sz w:val="19"/>
+        </w:rPr>
+        <w:t>Reference intervals for Indian elephants (Elephas maximus indicus) under human care (Frontiers Vet Sci 2025; PMC12301552). Note: elephant RBCs are LARGE (high MCV) and relatively few in number:</w:t>
+      </w:r>
+    </w:p>
+    <w:tbl>
+      <w:tblPr>
+        <w:tblStyle w:val="TableGrid"/>
+        <w:tblW w:type="auto" w:w="0"/>
+        <w:tblLook w:firstColumn="1" w:firstRow="1" w:lastColumn="0" w:lastRow="0" w:noHBand="0" w:noVBand="1" w:val="04A0"/>
+      </w:tblPr>
+      <w:tblGrid>
+        <w:gridCol w:w="3213"/>
+        <w:gridCol w:w="3213"/>
+        <w:gridCol w:w="3213"/>
+      </w:tblGrid>
+      <w:tr>
+        <w:tc>
+          <w:tcPr>
+            <w:tcW w:type="dxa" w:w="2268"/>
+            <w:shd w:val="clear" w:color="auto" w:fill="2D6A4F"/>
+          </w:tcPr>
+          <w:p>
+            <w:pPr>
+              <w:jc w:val="center"/>
+            </w:pPr>
+            <w:r>
+              <w:rPr>
+                <w:rFonts w:ascii="Calibri" w:hAnsi="Calibri"/>
+                <w:b/>
+                <w:color w:val="FFFFFF"/>
+                <w:sz w:val="17"/>
+              </w:rPr>
+              <w:t>Parameter</w:t>
+            </w:r>
+          </w:p>
+        </w:tc>
+        <w:tc>
+          <w:tcPr>
+            <w:tcW w:type="dxa" w:w="2835"/>
+            <w:shd w:val="clear" w:color="auto" w:fill="2D6A4F"/>
+          </w:tcPr>
+          <w:p>
+            <w:pPr>
+              <w:jc w:val="center"/>
+            </w:pPr>
+            <w:r>
+              <w:rPr>
+                <w:rFonts w:ascii="Calibri" w:hAnsi="Calibri"/>
+                <w:b/>
+                <w:color w:val="FFFFFF"/>
+                <w:sz w:val="17"/>
+              </w:rPr>
+              <w:t>Reference Interval</w:t>
+            </w:r>
+          </w:p>
+        </w:tc>
+        <w:tc>
+          <w:tcPr>
+            <w:tcW w:type="dxa" w:w="4535"/>
+            <w:shd w:val="clear" w:color="auto" w:fill="2D6A4F"/>
+          </w:tcPr>
+          <w:p>
+            <w:pPr>
+              <w:jc w:val="center"/>
+            </w:pPr>
+            <w:r>
+              <w:rPr>
+                <w:rFonts w:ascii="Calibri" w:hAnsi="Calibri"/>
+                <w:b/>
+                <w:color w:val="FFFFFF"/>
+                <w:sz w:val="17"/>
+              </w:rPr>
+              <w:t>Note</w:t>
+            </w:r>
+          </w:p>
+        </w:tc>
+      </w:tr>
+      <w:tr>
+        <w:tc>
+          <w:tcPr>
+            <w:tcW w:type="dxa" w:w="2268"/>
+            <w:shd w:val="clear" w:color="auto" w:fill="FFFFFF"/>
+          </w:tcPr>
+          <w:p>
+            <w:r>
+              <w:rPr>
+                <w:rFonts w:ascii="Calibri" w:hAnsi="Calibri"/>
+                <w:b w:val="0"/>
+                <w:color w:val="1A1A1A"/>
+                <w:sz w:val="17"/>
+              </w:rPr>
+              <w:t>Haemoglobin (Hb)</w:t>
+            </w:r>
+          </w:p>
+        </w:tc>
+        <w:tc>
+          <w:tcPr>
+            <w:tcW w:type="dxa" w:w="2835"/>
+            <w:shd w:val="clear" w:color="auto" w:fill="FFFFFF"/>
+          </w:tcPr>
+          <w:p>
+            <w:r>
+              <w:rPr>
+                <w:rFonts w:ascii="Calibri" w:hAnsi="Calibri"/>
+                <w:b w:val="0"/>
+                <w:color w:val="1A1A1A"/>
+                <w:sz w:val="17"/>
+              </w:rPr>
+              <w:t>8.62–16.78 g/dL</w:t>
+            </w:r>
+          </w:p>
+        </w:tc>
+        <w:tc>
+          <w:tcPr>
+            <w:tcW w:type="dxa" w:w="4535"/>
+            <w:shd w:val="clear" w:color="auto" w:fill="FFFFFF"/>
+          </w:tcPr>
+          <w:p>
+            <w:r>
+              <w:rPr>
+                <w:rFonts w:ascii="Calibri" w:hAnsi="Calibri"/>
+                <w:b w:val="0"/>
+                <w:color w:val="1A1A1A"/>
+                <w:sz w:val="17"/>
+              </w:rPr>
+              <w:t>Low Hb confirms anaemia</w:t>
+            </w:r>
+          </w:p>
+        </w:tc>
+      </w:tr>
+      <w:tr>
+        <w:tc>
+          <w:tcPr>
+            <w:tcW w:type="dxa" w:w="2268"/>
+            <w:shd w:val="clear" w:color="auto" w:fill="EAF7EE"/>
+          </w:tcPr>
+          <w:p>
+            <w:r>
+              <w:rPr>
+                <w:rFonts w:ascii="Calibri" w:hAnsi="Calibri"/>
+                <w:b w:val="0"/>
+                <w:color w:val="1A1A1A"/>
+                <w:sz w:val="17"/>
+              </w:rPr>
+              <w:t>PCV / Haematocrit</w:t>
+            </w:r>
+          </w:p>
+        </w:tc>
+        <w:tc>
+          <w:tcPr>
+            <w:tcW w:type="dxa" w:w="2835"/>
+            <w:shd w:val="clear" w:color="auto" w:fill="EAF7EE"/>
+          </w:tcPr>
+          <w:p>
+            <w:r>
+              <w:rPr>
+                <w:rFonts w:ascii="Calibri" w:hAnsi="Calibri"/>
+                <w:b w:val="0"/>
+                <w:color w:val="1A1A1A"/>
+                <w:sz w:val="17"/>
+              </w:rPr>
+              <w:t>21.73–49.25 %</w:t>
+            </w:r>
+          </w:p>
+        </w:tc>
+        <w:tc>
+          <w:tcPr>
+            <w:tcW w:type="dxa" w:w="4535"/>
+            <w:shd w:val="clear" w:color="auto" w:fill="EAF7EE"/>
+          </w:tcPr>
+          <w:p>
+            <w:r>
+              <w:rPr>
+                <w:rFonts w:ascii="Calibri" w:hAnsi="Calibri"/>
+                <w:b w:val="0"/>
+                <w:color w:val="1A1A1A"/>
+                <w:sz w:val="17"/>
+              </w:rPr>
+              <w:t>Packed cell volume</w:t>
+            </w:r>
+          </w:p>
+        </w:tc>
+      </w:tr>
+      <w:tr>
+        <w:tc>
+          <w:tcPr>
+            <w:tcW w:type="dxa" w:w="2268"/>
+            <w:shd w:val="clear" w:color="auto" w:fill="FFFFFF"/>
+          </w:tcPr>
+          <w:p>
+            <w:r>
+              <w:rPr>
+                <w:rFonts w:ascii="Calibri" w:hAnsi="Calibri"/>
+                <w:b w:val="0"/>
+                <w:color w:val="1A1A1A"/>
+                <w:sz w:val="17"/>
+              </w:rPr>
+              <w:t>RBC count</w:t>
+            </w:r>
+          </w:p>
+        </w:tc>
+        <w:tc>
+          <w:tcPr>
+            <w:tcW w:type="dxa" w:w="2835"/>
+            <w:shd w:val="clear" w:color="auto" w:fill="FFFFFF"/>
+          </w:tcPr>
+          <w:p>
+            <w:r>
+              <w:rPr>
+                <w:rFonts w:ascii="Calibri" w:hAnsi="Calibri"/>
+                <w:b w:val="0"/>
+                <w:color w:val="1A1A1A"/>
+                <w:sz w:val="17"/>
+              </w:rPr>
+              <w:t>1.77–4.9 ×10⁶/µL</w:t>
+            </w:r>
+          </w:p>
+        </w:tc>
+        <w:tc>
+          <w:tcPr>
+            <w:tcW w:type="dxa" w:w="4535"/>
+            <w:shd w:val="clear" w:color="auto" w:fill="FFFFFF"/>
+          </w:tcPr>
+          <w:p>
+            <w:r>
+              <w:rPr>
+                <w:rFonts w:ascii="Calibri" w:hAnsi="Calibri"/>
+                <w:b w:val="0"/>
+                <w:color w:val="1A1A1A"/>
+                <w:sz w:val="17"/>
+              </w:rPr>
+              <w:t>Relatively LOW count (large cells)</w:t>
+            </w:r>
+          </w:p>
+        </w:tc>
+      </w:tr>
+      <w:tr>
+        <w:tc>
+          <w:tcPr>
+            <w:tcW w:type="dxa" w:w="2268"/>
+            <w:shd w:val="clear" w:color="auto" w:fill="EAF7EE"/>
+          </w:tcPr>
+          <w:p>
+            <w:r>
+              <w:rPr>
+                <w:rFonts w:ascii="Calibri" w:hAnsi="Calibri"/>
+                <w:b w:val="0"/>
+                <w:color w:val="1A1A1A"/>
+                <w:sz w:val="17"/>
+              </w:rPr>
+              <w:t>MCV</w:t>
+            </w:r>
+          </w:p>
+        </w:tc>
+        <w:tc>
+          <w:tcPr>
+            <w:tcW w:type="dxa" w:w="2835"/>
+            <w:shd w:val="clear" w:color="auto" w:fill="EAF7EE"/>
+          </w:tcPr>
+          <w:p>
+            <w:r>
+              <w:rPr>
+                <w:rFonts w:ascii="Calibri" w:hAnsi="Calibri"/>
+                <w:b w:val="0"/>
+                <w:color w:val="1A1A1A"/>
+                <w:sz w:val="17"/>
+              </w:rPr>
+              <w:t>112.49–131.39 fL</w:t>
+            </w:r>
+          </w:p>
+        </w:tc>
+        <w:tc>
+          <w:tcPr>
+            <w:tcW w:type="dxa" w:w="4535"/>
+            <w:shd w:val="clear" w:color="auto" w:fill="EAF7EE"/>
+          </w:tcPr>
+          <w:p>
+            <w:r>
+              <w:rPr>
+                <w:rFonts w:ascii="Calibri" w:hAnsi="Calibri"/>
+                <w:b w:val="0"/>
+                <w:color w:val="1A1A1A"/>
+                <w:sz w:val="17"/>
+              </w:rPr>
+              <w:t>HIGH — elephant RBCs are large</w:t>
+            </w:r>
+          </w:p>
+        </w:tc>
+      </w:tr>
+      <w:tr>
+        <w:tc>
+          <w:tcPr>
+            <w:tcW w:type="dxa" w:w="2268"/>
+            <w:shd w:val="clear" w:color="auto" w:fill="FFFFFF"/>
+          </w:tcPr>
+          <w:p>
+            <w:r>
+              <w:rPr>
+                <w:rFonts w:ascii="Calibri" w:hAnsi="Calibri"/>
+                <w:b w:val="0"/>
+                <w:color w:val="1A1A1A"/>
+                <w:sz w:val="17"/>
+              </w:rPr>
+              <w:t>MCH</w:t>
+            </w:r>
+          </w:p>
+        </w:tc>
+        <w:tc>
+          <w:tcPr>
+            <w:tcW w:type="dxa" w:w="2835"/>
+            <w:shd w:val="clear" w:color="auto" w:fill="FFFFFF"/>
+          </w:tcPr>
+          <w:p>
+            <w:r>
+              <w:rPr>
+                <w:rFonts w:ascii="Calibri" w:hAnsi="Calibri"/>
+                <w:b w:val="0"/>
+                <w:color w:val="1A1A1A"/>
+                <w:sz w:val="17"/>
+              </w:rPr>
+              <w:t>39.3–62.39 pg</w:t>
+            </w:r>
+          </w:p>
+        </w:tc>
+        <w:tc>
+          <w:tcPr>
+            <w:tcW w:type="dxa" w:w="4535"/>
+            <w:shd w:val="clear" w:color="auto" w:fill="FFFFFF"/>
+          </w:tcPr>
+          <w:p>
+            <w:r>
+              <w:rPr>
+                <w:rFonts w:ascii="Calibri" w:hAnsi="Calibri"/>
+                <w:b w:val="0"/>
+                <w:color w:val="1A1A1A"/>
+                <w:sz w:val="17"/>
+              </w:rPr>
+              <w:t>Mean cell haemoglobin</w:t>
+            </w:r>
+          </w:p>
+        </w:tc>
+      </w:tr>
+      <w:tr>
+        <w:tc>
+          <w:tcPr>
+            <w:tcW w:type="dxa" w:w="2268"/>
+            <w:shd w:val="clear" w:color="auto" w:fill="EAF7EE"/>
+          </w:tcPr>
+          <w:p>
+            <w:r>
+              <w:rPr>
+                <w:rFonts w:ascii="Calibri" w:hAnsi="Calibri"/>
+                <w:b w:val="0"/>
+                <w:color w:val="1A1A1A"/>
+                <w:sz w:val="17"/>
+              </w:rPr>
+              <w:t>MCHC</w:t>
+            </w:r>
+          </w:p>
+        </w:tc>
+        <w:tc>
+          <w:tcPr>
+            <w:tcW w:type="dxa" w:w="2835"/>
+            <w:shd w:val="clear" w:color="auto" w:fill="EAF7EE"/>
+          </w:tcPr>
+          <w:p>
+            <w:r>
+              <w:rPr>
+                <w:rFonts w:ascii="Calibri" w:hAnsi="Calibri"/>
+                <w:b w:val="0"/>
+                <w:color w:val="1A1A1A"/>
+                <w:sz w:val="17"/>
+              </w:rPr>
+              <w:t>33.40–41.0 g/dL</w:t>
+            </w:r>
+          </w:p>
+        </w:tc>
+        <w:tc>
+          <w:tcPr>
+            <w:tcW w:type="dxa" w:w="4535"/>
+            <w:shd w:val="clear" w:color="auto" w:fill="EAF7EE"/>
+          </w:tcPr>
+          <w:p>
+            <w:r>
+              <w:rPr>
+                <w:rFonts w:ascii="Calibri" w:hAnsi="Calibri"/>
+                <w:b w:val="0"/>
+                <w:color w:val="1A1A1A"/>
+                <w:sz w:val="17"/>
+              </w:rPr>
+              <w:t>Mean cell Hb concentration</w:t>
+            </w:r>
+          </w:p>
+        </w:tc>
+      </w:tr>
+      <w:tr>
+        <w:tc>
+          <w:tcPr>
+            <w:tcW w:type="dxa" w:w="2268"/>
+            <w:shd w:val="clear" w:color="auto" w:fill="FFFFFF"/>
+          </w:tcPr>
+          <w:p>
+            <w:r>
+              <w:rPr>
+                <w:rFonts w:ascii="Calibri" w:hAnsi="Calibri"/>
+                <w:b w:val="0"/>
+                <w:color w:val="1A1A1A"/>
+                <w:sz w:val="17"/>
+              </w:rPr>
+              <w:t>WBC (TLC)</w:t>
+            </w:r>
+          </w:p>
+        </w:tc>
+        <w:tc>
+          <w:tcPr>
+            <w:tcW w:type="dxa" w:w="2835"/>
+            <w:shd w:val="clear" w:color="auto" w:fill="FFFFFF"/>
+          </w:tcPr>
+          <w:p>
+            <w:r>
+              <w:rPr>
+                <w:rFonts w:ascii="Calibri" w:hAnsi="Calibri"/>
+                <w:b w:val="0"/>
+                <w:color w:val="1A1A1A"/>
+                <w:sz w:val="17"/>
+              </w:rPr>
+              <w:t>9,912–29,475 cells/µL</w:t>
+            </w:r>
+          </w:p>
+        </w:tc>
+        <w:tc>
+          <w:tcPr>
+            <w:tcW w:type="dxa" w:w="4535"/>
+            <w:shd w:val="clear" w:color="auto" w:fill="FFFFFF"/>
+          </w:tcPr>
+          <w:p>
+            <w:r>
+              <w:rPr>
+                <w:rFonts w:ascii="Calibri" w:hAnsi="Calibri"/>
+                <w:b w:val="0"/>
+                <w:color w:val="1A1A1A"/>
+                <w:sz w:val="17"/>
+              </w:rPr>
+              <w:t>Total leucocyte count</w:t>
+            </w:r>
+          </w:p>
+        </w:tc>
+      </w:tr>
+      <w:tr>
+        <w:tc>
+          <w:tcPr>
+            <w:tcW w:type="dxa" w:w="2268"/>
+            <w:shd w:val="clear" w:color="auto" w:fill="EAF7EE"/>
+          </w:tcPr>
+          <w:p>
+            <w:r>
+              <w:rPr>
+                <w:rFonts w:ascii="Calibri" w:hAnsi="Calibri"/>
+                <w:b w:val="0"/>
+                <w:color w:val="1A1A1A"/>
+                <w:sz w:val="17"/>
+              </w:rPr>
+              <w:t>Platelets</w:t>
+            </w:r>
+          </w:p>
+        </w:tc>
+        <w:tc>
+          <w:tcPr>
+            <w:tcW w:type="dxa" w:w="2835"/>
+            <w:shd w:val="clear" w:color="auto" w:fill="EAF7EE"/>
+          </w:tcPr>
+          <w:p>
+            <w:r>
+              <w:rPr>
+                <w:rFonts w:ascii="Calibri" w:hAnsi="Calibri"/>
+                <w:b w:val="0"/>
+                <w:color w:val="1A1A1A"/>
+                <w:sz w:val="17"/>
+              </w:rPr>
+              <w:t>171.6–947.1 ×10³/µL</w:t>
+            </w:r>
+          </w:p>
+        </w:tc>
+        <w:tc>
+          <w:tcPr>
+            <w:tcW w:type="dxa" w:w="4535"/>
+            <w:shd w:val="clear" w:color="auto" w:fill="EAF7EE"/>
+          </w:tcPr>
+          <w:p>
+            <w:r>
+              <w:rPr>
+                <w:rFonts w:ascii="Calibri" w:hAnsi="Calibri"/>
+                <w:b w:val="0"/>
+                <w:color w:val="1A1A1A"/>
+                <w:sz w:val="17"/>
+              </w:rPr>
+              <w:t>—</w:t>
+            </w:r>
+          </w:p>
+        </w:tc>
+      </w:tr>
+    </w:tbl>
+    <w:p>
+      <w:pPr>
+        <w:spacing w:after="40"/>
+      </w:pPr>
+    </w:p>
+    <w:p>
+      <w:pPr>
         <w:spacing w:after="40"/>
         <w:ind w:left="283" w:hanging="170"/>
       </w:pPr>
@@ -5721,7 +8874,7 @@
           <w:color w:val="1A1A1A"/>
           <w:sz w:val="19"/>
         </w:rPr>
-        <w:t>•  BLOOD EXAMINATION: Low Haemoglobin (Hb)</w:t>
+        <w:t>•  DISTINCTIVE MORPHOLOGY: elephants (Afrotheria) have HETEROPHILS instead of neutrophils, and a unique MONOCYTE with a bilobed/trilobed nucleus (peroxidase-positive); MONOCYTES are the most abundant leucocyte in healthy elephants</w:t>
       </w:r>
     </w:p>
     <w:p>
@@ -5735,35 +8888,7 @@
           <w:color w:val="1A1A1A"/>
           <w:sz w:val="19"/>
         </w:rPr>
-        <w:t>•  BLOOD SMEAR: typical TARGET CELLS (codocytes) — RBCs that are MICROCYTIC (small) and HYPOCHROMIC (pale, with increased central pallor)</w:t>
-      </w:r>
-    </w:p>
-    <w:p>
-      <w:pPr>
-        <w:spacing w:after="40"/>
-        <w:ind w:left="283" w:hanging="170"/>
-      </w:pPr>
-      <w:r>
-        <w:rPr>
-          <w:rFonts w:ascii="Calibri" w:hAnsi="Calibri"/>
-          <w:color w:val="1A1A1A"/>
-          <w:sz w:val="19"/>
-        </w:rPr>
-        <w:t>•  Target cell appearance is characteristic of iron deficiency (and also seen in liver disease, thalassaemia in other species)</w:t>
-      </w:r>
-    </w:p>
-    <w:p>
-      <w:pPr>
-        <w:spacing w:after="40"/>
-        <w:ind w:left="283" w:hanging="170"/>
-      </w:pPr>
-      <w:r>
-        <w:rPr>
-          <w:rFonts w:ascii="Calibri" w:hAnsi="Calibri"/>
-          <w:color w:val="1A1A1A"/>
-          <w:sz w:val="19"/>
-        </w:rPr>
-        <w:t>•  Reference normal Hb range (Indian captive elephants, web-elaborated): ~8.6–16.8 g/dL; values below this range confirm anaemia</w:t>
+        <w:t>•  Automated analysers are INACCURATE for elephant blood — a manual Wright/Giemsa differential is preferred</w:t>
       </w:r>
     </w:p>
     <w:tbl>
@@ -5792,7 +8917,244 @@
                 <w:color w:val="FFFFFF"/>
                 <w:sz w:val="21"/>
               </w:rPr>
-              <w:t>9.4  Treatment</w:t>
+              <w:t>9.4  Diagnosis</w:t>
+            </w:r>
+          </w:p>
+        </w:tc>
+      </w:tr>
+    </w:tbl>
+    <w:p>
+      <w:pPr>
+        <w:spacing w:after="40"/>
+      </w:pPr>
+    </w:p>
+    <w:p>
+      <w:pPr>
+        <w:spacing w:after="40"/>
+        <w:ind w:left="283" w:hanging="170"/>
+      </w:pPr>
+      <w:r>
+        <w:rPr>
+          <w:rFonts w:ascii="Calibri" w:hAnsi="Calibri"/>
+          <w:color w:val="1A1A1A"/>
+          <w:sz w:val="19"/>
+        </w:rPr>
+        <w:t>•  BLOOD EXAMINATION: Low Haemoglobin (Hb) below the reference interval</w:t>
+      </w:r>
+    </w:p>
+    <w:p>
+      <w:pPr>
+        <w:spacing w:after="40"/>
+        <w:ind w:left="283" w:hanging="170"/>
+      </w:pPr>
+      <w:r>
+        <w:rPr>
+          <w:rFonts w:ascii="Calibri" w:hAnsi="Calibri"/>
+          <w:color w:val="1A1A1A"/>
+          <w:sz w:val="19"/>
+        </w:rPr>
+        <w:t>•  BLOOD SMEAR: target cells (codocytes), hypochromia, microcytosis, anisocytosis (microcytic-hypochromic pattern supports iron deficiency by general veterinary principle)</w:t>
+      </w:r>
+    </w:p>
+    <w:p>
+      <w:pPr>
+        <w:spacing w:after="40"/>
+        <w:ind w:left="283" w:hanging="170"/>
+      </w:pPr>
+      <w:r>
+        <w:rPr>
+          <w:rFonts w:ascii="Calibri" w:hAnsi="Calibri"/>
+          <w:color w:val="1A1A1A"/>
+          <w:sz w:val="19"/>
+        </w:rPr>
+        <w:t>•  IRON PANEL: serum iron, ferritin, TIBC, transferrin saturation (low iron + high TIBC + low ferritin = deficiency); hepcidin in research settings</w:t>
+      </w:r>
+    </w:p>
+    <w:p>
+      <w:pPr>
+        <w:spacing w:after="40"/>
+        <w:ind w:left="283" w:hanging="170"/>
+      </w:pPr>
+      <w:r>
+        <w:rPr>
+          <w:rFonts w:ascii="Calibri" w:hAnsi="Calibri"/>
+          <w:color w:val="1A1A1A"/>
+          <w:sz w:val="19"/>
+        </w:rPr>
+        <w:t>•  PARASITOLOGY: faecal egg counts to identify blood-feeding helminths (see 9.2)</w:t>
+      </w:r>
+    </w:p>
+    <w:tbl>
+      <w:tblPr>
+        <w:tblStyle w:val="TableGrid"/>
+        <w:tblW w:type="auto" w:w="0"/>
+        <w:tblLook w:firstColumn="1" w:firstRow="1" w:lastColumn="0" w:lastRow="0" w:noHBand="0" w:noVBand="1" w:val="04A0"/>
+      </w:tblPr>
+      <w:tblGrid>
+        <w:gridCol w:w="9638"/>
+      </w:tblGrid>
+      <w:tr>
+        <w:tc>
+          <w:tcPr>
+            <w:tcW w:type="dxa" w:w="9638"/>
+            <w:shd w:val="clear" w:color="auto" w:fill="2D6A4F"/>
+          </w:tcPr>
+          <w:p>
+            <w:pPr>
+              <w:spacing w:before="80" w:after="80"/>
+            </w:pPr>
+            <w:r>
+              <w:rPr>
+                <w:rFonts w:ascii="Calibri" w:hAnsi="Calibri"/>
+                <w:b/>
+                <w:color w:val="FFFFFF"/>
+                <w:sz w:val="21"/>
+              </w:rPr>
+              <w:t>9.5  Causes of Anaemia in Elephants</w:t>
+            </w:r>
+          </w:p>
+        </w:tc>
+      </w:tr>
+    </w:tbl>
+    <w:p>
+      <w:pPr>
+        <w:spacing w:after="40"/>
+      </w:pPr>
+    </w:p>
+    <w:p>
+      <w:pPr>
+        <w:spacing w:after="40"/>
+        <w:ind w:left="283" w:hanging="170"/>
+      </w:pPr>
+      <w:r>
+        <w:rPr>
+          <w:rFonts w:ascii="Calibri" w:hAnsi="Calibri"/>
+          <w:color w:val="1A1A1A"/>
+          <w:sz w:val="19"/>
+        </w:rPr>
+        <w:t>•  GI STRONGYLE NEMATODES (Murshidia, Quilonia, Bathmostomum, Equinurbia) → protein-losing gastroenteropathy → hypoalbuminaemia + anaemia</w:t>
+      </w:r>
+    </w:p>
+    <w:p>
+      <w:pPr>
+        <w:spacing w:after="40"/>
+        <w:ind w:left="283" w:hanging="170"/>
+      </w:pPr>
+      <w:r>
+        <w:rPr>
+          <w:rFonts w:ascii="Calibri" w:hAnsi="Calibri"/>
+          <w:color w:val="1A1A1A"/>
+          <w:sz w:val="19"/>
+        </w:rPr>
+        <w:t>•  HOOKWORMS: Bathmostomum sangeri (caecum/colon) and Grammocephalus hybridatus (bile duct/liver) — blood-feeders causing anaemia, weakness, hepatic insufficiency</w:t>
+      </w:r>
+    </w:p>
+    <w:p>
+      <w:pPr>
+        <w:spacing w:after="40"/>
+        <w:ind w:left="283" w:hanging="170"/>
+      </w:pPr>
+      <w:r>
+        <w:rPr>
+          <w:rFonts w:ascii="Calibri" w:hAnsi="Calibri"/>
+          <w:color w:val="1A1A1A"/>
+          <w:sz w:val="19"/>
+        </w:rPr>
+        <w:t>•  LIVER FLUKE Fasciola (Fascioloides) jacksoni — prevalence 18–62% in the Indomalayan region; causes anaemia + hypoproteinaemia, hepatic congestion/fibrosis</w:t>
+      </w:r>
+    </w:p>
+    <w:p>
+      <w:pPr>
+        <w:spacing w:after="40"/>
+        <w:ind w:left="283" w:hanging="170"/>
+      </w:pPr>
+      <w:r>
+        <w:rPr>
+          <w:rFonts w:ascii="Calibri" w:hAnsi="Calibri"/>
+          <w:color w:val="1A1A1A"/>
+          <w:sz w:val="19"/>
+        </w:rPr>
+        <w:t>•  NUTRITIONAL: iron, copper, cobalt deficiency (copper is needed for iron mobilisation); captive diets often deficient</w:t>
+      </w:r>
+    </w:p>
+    <w:p>
+      <w:pPr>
+        <w:spacing w:after="40"/>
+        <w:ind w:left="283" w:hanging="170"/>
+      </w:pPr>
+      <w:r>
+        <w:rPr>
+          <w:rFonts w:ascii="Calibri" w:hAnsi="Calibri"/>
+          <w:color w:val="1A1A1A"/>
+          <w:sz w:val="19"/>
+        </w:rPr>
+        <w:t>•  ANAEMIA OF CHRONIC DISEASE: especially chronic M. tuberculosis (iron-sequestration); EEHV in calves causes acute anaemia + thrombocytopenia</w:t>
+      </w:r>
+    </w:p>
+    <w:tbl>
+      <w:tblPr>
+        <w:tblStyle w:val="TableGrid"/>
+        <w:tblW w:type="auto" w:w="0"/>
+        <w:tblLook w:firstColumn="1" w:firstRow="1" w:lastColumn="0" w:lastRow="0" w:noHBand="0" w:noVBand="1" w:val="04A0"/>
+      </w:tblPr>
+      <w:tblGrid>
+        <w:gridCol w:w="9638"/>
+      </w:tblGrid>
+      <w:tr>
+        <w:tc>
+          <w:tcPr>
+            <w:tcW w:type="dxa" w:w="9638"/>
+            <w:shd w:val="clear" w:color="auto" w:fill="FAE0D8"/>
+          </w:tcPr>
+          <w:p>
+            <w:pPr>
+              <w:spacing w:before="100" w:after="100"/>
+            </w:pPr>
+            <w:r>
+              <w:rPr>
+                <w:rFonts w:ascii="Calibri" w:hAnsi="Calibri"/>
+                <w:b/>
+                <w:color w:val="8B0000"/>
+                <w:sz w:val="18"/>
+              </w:rPr>
+              <w:t>IRON OVERLOAD CAUTION: Iron storage disease (haemochromatosis-type) is a recognised problem in captive elephants from excess dietary iron. Crucially, blind iron supplementation can REACTIVATE latent infections such as M. tuberculosis (iron feeds the pathogen). Confirm true iron-deficiency with an iron panel BEFORE supplementing — do not supplement reflexively. Adult forage requirement: Cu 10, Fe 50, Co 0.1 mg/kg.</w:t>
+            </w:r>
+          </w:p>
+        </w:tc>
+      </w:tr>
+    </w:tbl>
+    <w:p>
+      <w:pPr>
+        <w:spacing w:after="40"/>
+      </w:pPr>
+    </w:p>
+    <w:tbl>
+      <w:tblPr>
+        <w:tblStyle w:val="TableGrid"/>
+        <w:tblW w:type="auto" w:w="0"/>
+        <w:tblLook w:firstColumn="1" w:firstRow="1" w:lastColumn="0" w:lastRow="0" w:noHBand="0" w:noVBand="1" w:val="04A0"/>
+      </w:tblPr>
+      <w:tblGrid>
+        <w:gridCol w:w="9638"/>
+      </w:tblGrid>
+      <w:tr>
+        <w:tc>
+          <w:tcPr>
+            <w:tcW w:type="dxa" w:w="9638"/>
+            <w:shd w:val="clear" w:color="auto" w:fill="2D6A4F"/>
+          </w:tcPr>
+          <w:p>
+            <w:pPr>
+              <w:spacing w:before="80" w:after="80"/>
+            </w:pPr>
+            <w:r>
+              <w:rPr>
+                <w:rFonts w:ascii="Calibri" w:hAnsi="Calibri"/>
+                <w:b/>
+                <w:color w:val="FFFFFF"/>
+                <w:sz w:val="21"/>
+              </w:rPr>
+              <w:t>9.6  Treatment</w:t>
             </w:r>
           </w:p>
         </w:tc>
@@ -6180,7 +9542,105 @@
           <w:color w:val="1A1A1A"/>
           <w:sz w:val="19"/>
         </w:rPr>
-        <w:t>•  Hooijberg EH et al. (2023). Haematology reference intervals for Asian elephants. (Indian captive elephant blood parameters)</w:t>
+        <w:t>•  Reference intervals for haematology &amp; biochemistry in Indian elephants (Elephas maximus indicus) under human care (2025). Frontiers in Veterinary Science 12: 1602296 (PMC12301552)</w:t>
+      </w:r>
+    </w:p>
+    <w:p>
+      <w:pPr>
+        <w:spacing w:after="40"/>
+        <w:ind w:left="283" w:hanging="170"/>
+      </w:pPr>
+      <w:r>
+        <w:rPr>
+          <w:rFonts w:ascii="Calibri" w:hAnsi="Calibri"/>
+          <w:color w:val="1A1A1A"/>
+          <w:sz w:val="19"/>
+        </w:rPr>
+        <w:t>•  Schulze C, Peters M, Baumgärtner W, Wohlsein P (2016). Electrical Injuries in Animals: Causes, Pathogenesis, and Morphological Findings. Veterinary Pathology 53(5): 1018–1037</w:t>
+      </w:r>
+    </w:p>
+    <w:p>
+      <w:pPr>
+        <w:spacing w:after="40"/>
+        <w:ind w:left="283" w:hanging="170"/>
+      </w:pPr>
+      <w:r>
+        <w:rPr>
+          <w:rFonts w:ascii="Calibri" w:hAnsi="Calibri"/>
+          <w:color w:val="1A1A1A"/>
+          <w:sz w:val="19"/>
+        </w:rPr>
+        <w:t>•  Agnew DW, Munson L, Ramsay EC (2004). Cystic Endometrial Hyperplasia in Elephants. Veterinary Pathology 41(2): 179–183</w:t>
+      </w:r>
+    </w:p>
+    <w:p>
+      <w:pPr>
+        <w:spacing w:after="40"/>
+        <w:ind w:left="283" w:hanging="170"/>
+      </w:pPr>
+      <w:r>
+        <w:rPr>
+          <w:rFonts w:ascii="Calibri" w:hAnsi="Calibri"/>
+          <w:color w:val="1A1A1A"/>
+          <w:sz w:val="19"/>
+        </w:rPr>
+        <w:t>•  Hermes R, Hildebrandt TB, Göritz F (2004). Asymmetric reproductive aging in long-term captivity. Animal Reproduction Science 82–83: 49–60</w:t>
+      </w:r>
+    </w:p>
+    <w:p>
+      <w:pPr>
+        <w:spacing w:after="40"/>
+        <w:ind w:left="283" w:hanging="170"/>
+      </w:pPr>
+      <w:r>
+        <w:rPr>
+          <w:rFonts w:ascii="Calibri" w:hAnsi="Calibri"/>
+          <w:color w:val="1A1A1A"/>
+          <w:sz w:val="19"/>
+        </w:rPr>
+        <w:t>•  Landolfi JA et al. (2021). Reproductive Tract Neoplasia in Adult Female Asian Elephants. Veterinary Pathology 58(6)</w:t>
+      </w:r>
+    </w:p>
+    <w:p>
+      <w:pPr>
+        <w:spacing w:after="40"/>
+        <w:ind w:left="283" w:hanging="170"/>
+      </w:pPr>
+      <w:r>
+        <w:rPr>
+          <w:rFonts w:ascii="Calibri" w:hAnsi="Calibri"/>
+          <w:color w:val="1A1A1A"/>
+          <w:sz w:val="19"/>
+        </w:rPr>
+        <w:t>•  Dunkin RC et al. (2013). Climate influences thermal balance and water use in elephants. Journal of Experimental Biology 216: 2939–2952</w:t>
+      </w:r>
+    </w:p>
+    <w:p>
+      <w:pPr>
+        <w:spacing w:after="40"/>
+        <w:ind w:left="283" w:hanging="170"/>
+      </w:pPr>
+      <w:r>
+        <w:rPr>
+          <w:rFonts w:ascii="Calibri" w:hAnsi="Calibri"/>
+          <w:color w:val="1A1A1A"/>
+          <w:sz w:val="19"/>
+        </w:rPr>
+        <w:t>•  Martins AF et al. (2018). Bending cracks in African elephant skin. Nature Communications 9: 3865</w:t>
+      </w:r>
+    </w:p>
+    <w:p>
+      <w:pPr>
+        <w:spacing w:after="40"/>
+        <w:ind w:left="283" w:hanging="170"/>
+      </w:pPr>
+      <w:r>
+        <w:rPr>
+          <w:rFonts w:ascii="Calibri" w:hAnsi="Calibri"/>
+          <w:color w:val="1A1A1A"/>
+          <w:sz w:val="19"/>
+        </w:rPr>
+        <w:t>•  Rowe MF et al. (2013). Heat storage in Asian elephants during submaximal exercise. J Exp Biology 216: 1774–1785</w:t>
       </w:r>
     </w:p>
     <w:p>
@@ -6195,6 +9655,34 @@
           <w:sz w:val="19"/>
         </w:rPr>
         <w:t>•  Mahato G et al. (2021). Heavy metal toxicosis in wild and captive elephants — review. Indian Journal of Veterinary Pathology</w:t>
+      </w:r>
+    </w:p>
+    <w:p>
+      <w:pPr>
+        <w:spacing w:after="40"/>
+        <w:ind w:left="283" w:hanging="170"/>
+      </w:pPr>
+      <w:r>
+        <w:rPr>
+          <w:rFonts w:ascii="Calibri" w:hAnsi="Calibri"/>
+          <w:color w:val="1A1A1A"/>
+          <w:sz w:val="19"/>
+        </w:rPr>
+        <w:t>•  Lok Sabha Unstarred Question reply (July 2024). Elephant deaths from unnatural causes 2019–2024. MoEFCC, Government of India</w:t>
+      </w:r>
+    </w:p>
+    <w:p>
+      <w:pPr>
+        <w:spacing w:after="40"/>
+        <w:ind w:left="283" w:hanging="170"/>
+      </w:pPr>
+      <w:r>
+        <w:rPr>
+          <w:rFonts w:ascii="Calibri" w:hAnsi="Calibri"/>
+          <w:color w:val="1A1A1A"/>
+          <w:sz w:val="19"/>
+        </w:rPr>
+        <w:t>•  Karnataka High Court (2025). Suo Motu W.P. on elephant electrocution ("Ashwathamma" case) — power-line management directions</w:t>
       </w:r>
     </w:p>
     <w:p>

</xml_diff>